<commit_message>
docs: adding tag milestone screenshot to CA2 PDF
</commit_message>
<xml_diff>
--- a/Docs/CA2.docx
+++ b/Docs/CA2.docx
@@ -1771,6 +1771,7 @@
       <w:r>
         <w:rPr>
           <w:rFonts w:asciiTheme="minorHAnsi" w:hAnsiTheme="minorHAnsi"/>
+          <w:noProof/>
           <w:sz w:val="22"/>
           <w:szCs w:val="22"/>
         </w:rPr>
@@ -1935,6 +1936,7 @@
       <w:r>
         <w:rPr>
           <w:rFonts w:asciiTheme="minorHAnsi" w:hAnsiTheme="minorHAnsi"/>
+          <w:noProof/>
           <w:color w:val="156082" w:themeColor="accent1"/>
           <w:sz w:val="22"/>
           <w:szCs w:val="22"/>
@@ -2092,6 +2094,7 @@
       <w:r>
         <w:rPr>
           <w:rFonts w:asciiTheme="minorHAnsi" w:hAnsiTheme="minorHAnsi"/>
+          <w:noProof/>
         </w:rPr>
         <w:lastRenderedPageBreak/>
         <w:drawing>
@@ -2843,7 +2846,16 @@
                 <w:sz w:val="22"/>
                 <w:szCs w:val="22"/>
               </w:rPr>
-              <w:t>Rpc_PlayEmote</w:t>
+              <w:t>Rpc_</w:t>
+            </w:r>
+            <w:proofErr w:type="gramStart"/>
+            <w:r>
+              <w:rPr>
+                <w:rFonts w:asciiTheme="minorHAnsi" w:eastAsia="Courier New" w:hAnsiTheme="minorHAnsi"/>
+                <w:sz w:val="22"/>
+                <w:szCs w:val="22"/>
+              </w:rPr>
+              <w:t>PlayEmote</w:t>
             </w:r>
             <w:proofErr w:type="spellEnd"/>
             <w:r>
@@ -2852,7 +2864,16 @@
                 <w:sz w:val="22"/>
                 <w:szCs w:val="22"/>
               </w:rPr>
-              <w:t>()</w:t>
+              <w:t>(</w:t>
+            </w:r>
+            <w:proofErr w:type="gramEnd"/>
+            <w:r>
+              <w:rPr>
+                <w:rFonts w:asciiTheme="minorHAnsi" w:eastAsia="Courier New" w:hAnsiTheme="minorHAnsi"/>
+                <w:sz w:val="22"/>
+                <w:szCs w:val="22"/>
+              </w:rPr>
+              <w:t>)</w:t>
             </w:r>
           </w:p>
         </w:tc>
@@ -2908,7 +2929,25 @@
                 <w:sz w:val="22"/>
                 <w:szCs w:val="22"/>
               </w:rPr>
-              <w:t>One-shot event; late joiner doesn't need emote history</w:t>
+              <w:t xml:space="preserve">One-shot </w:t>
+            </w:r>
+            <w:proofErr w:type="gramStart"/>
+            <w:r>
+              <w:rPr>
+                <w:rFonts w:asciiTheme="minorHAnsi" w:hAnsiTheme="minorHAnsi"/>
+                <w:sz w:val="22"/>
+                <w:szCs w:val="22"/>
+              </w:rPr>
+              <w:t>event;</w:t>
+            </w:r>
+            <w:proofErr w:type="gramEnd"/>
+            <w:r>
+              <w:rPr>
+                <w:rFonts w:asciiTheme="minorHAnsi" w:hAnsiTheme="minorHAnsi"/>
+                <w:sz w:val="22"/>
+                <w:szCs w:val="22"/>
+              </w:rPr>
+              <w:t xml:space="preserve"> late joiner doesn't need emote history</w:t>
             </w:r>
           </w:p>
         </w:tc>
@@ -2934,7 +2973,16 @@
                 <w:sz w:val="22"/>
                 <w:szCs w:val="22"/>
               </w:rPr>
-              <w:t>Rpc_GameOver</w:t>
+              <w:t>Rpc_</w:t>
+            </w:r>
+            <w:proofErr w:type="gramStart"/>
+            <w:r>
+              <w:rPr>
+                <w:rFonts w:asciiTheme="minorHAnsi" w:eastAsia="Courier New" w:hAnsiTheme="minorHAnsi"/>
+                <w:sz w:val="22"/>
+                <w:szCs w:val="22"/>
+              </w:rPr>
+              <w:t>GameOver</w:t>
             </w:r>
             <w:proofErr w:type="spellEnd"/>
             <w:r>
@@ -2943,7 +2991,16 @@
                 <w:sz w:val="22"/>
                 <w:szCs w:val="22"/>
               </w:rPr>
-              <w:t>()</w:t>
+              <w:t>(</w:t>
+            </w:r>
+            <w:proofErr w:type="gramEnd"/>
+            <w:r>
+              <w:rPr>
+                <w:rFonts w:asciiTheme="minorHAnsi" w:eastAsia="Courier New" w:hAnsiTheme="minorHAnsi"/>
+                <w:sz w:val="22"/>
+                <w:szCs w:val="22"/>
+              </w:rPr>
+              <w:t>)</w:t>
             </w:r>
           </w:p>
         </w:tc>
@@ -3044,7 +3101,16 @@
                 <w:sz w:val="22"/>
                 <w:szCs w:val="22"/>
               </w:rPr>
-              <w:t>Rpc_GrantScore</w:t>
+              <w:t>Rpc_</w:t>
+            </w:r>
+            <w:proofErr w:type="gramStart"/>
+            <w:r>
+              <w:rPr>
+                <w:rFonts w:asciiTheme="minorHAnsi" w:eastAsia="Courier New" w:hAnsiTheme="minorHAnsi"/>
+                <w:sz w:val="22"/>
+                <w:szCs w:val="22"/>
+              </w:rPr>
+              <w:t>GrantScore</w:t>
             </w:r>
             <w:proofErr w:type="spellEnd"/>
             <w:r>
@@ -3053,7 +3119,16 @@
                 <w:sz w:val="22"/>
                 <w:szCs w:val="22"/>
               </w:rPr>
-              <w:t>()</w:t>
+              <w:t>(</w:t>
+            </w:r>
+            <w:proofErr w:type="gramEnd"/>
+            <w:r>
+              <w:rPr>
+                <w:rFonts w:asciiTheme="minorHAnsi" w:eastAsia="Courier New" w:hAnsiTheme="minorHAnsi"/>
+                <w:sz w:val="22"/>
+                <w:szCs w:val="22"/>
+              </w:rPr>
+              <w:t>)</w:t>
             </w:r>
           </w:p>
         </w:tc>
@@ -3112,6 +3187,7 @@
               <w:t xml:space="preserve">RPC routes scoring authority; target player's </w:t>
             </w:r>
             <w:proofErr w:type="spellStart"/>
+            <w:proofErr w:type="gramStart"/>
             <w:r>
               <w:rPr>
                 <w:rFonts w:asciiTheme="minorHAnsi" w:eastAsia="Courier New" w:hAnsiTheme="minorHAnsi"/>
@@ -3127,7 +3203,16 @@
                 <w:sz w:val="22"/>
                 <w:szCs w:val="22"/>
               </w:rPr>
-              <w:t>()</w:t>
+              <w:t>(</w:t>
+            </w:r>
+            <w:proofErr w:type="gramEnd"/>
+            <w:r>
+              <w:rPr>
+                <w:rFonts w:asciiTheme="minorHAnsi" w:eastAsia="Courier New" w:hAnsiTheme="minorHAnsi"/>
+                <w:sz w:val="22"/>
+                <w:szCs w:val="22"/>
+              </w:rPr>
+              <w:t>)</w:t>
             </w:r>
             <w:r>
               <w:rPr>
@@ -3161,7 +3246,16 @@
                 <w:sz w:val="22"/>
                 <w:szCs w:val="22"/>
               </w:rPr>
-              <w:t>Rpc_CastVote</w:t>
+              <w:t>Rpc_</w:t>
+            </w:r>
+            <w:proofErr w:type="gramStart"/>
+            <w:r>
+              <w:rPr>
+                <w:rFonts w:asciiTheme="minorHAnsi" w:eastAsia="Courier New" w:hAnsiTheme="minorHAnsi"/>
+                <w:sz w:val="22"/>
+                <w:szCs w:val="22"/>
+              </w:rPr>
+              <w:t>CastVote</w:t>
             </w:r>
             <w:proofErr w:type="spellEnd"/>
             <w:r>
@@ -3170,7 +3264,16 @@
                 <w:sz w:val="22"/>
                 <w:szCs w:val="22"/>
               </w:rPr>
-              <w:t>()</w:t>
+              <w:t>(</w:t>
+            </w:r>
+            <w:proofErr w:type="gramEnd"/>
+            <w:r>
+              <w:rPr>
+                <w:rFonts w:asciiTheme="minorHAnsi" w:eastAsia="Courier New" w:hAnsiTheme="minorHAnsi"/>
+                <w:sz w:val="22"/>
+                <w:szCs w:val="22"/>
+              </w:rPr>
+              <w:t>)</w:t>
             </w:r>
           </w:p>
         </w:tc>
@@ -3447,63 +3550,7 @@
           <w:sz w:val="22"/>
           <w:szCs w:val="22"/>
         </w:rPr>
-        <w:t xml:space="preserve"> </w:t>
-      </w:r>
-      <w:r>
-        <w:rPr>
-          <w:rFonts w:asciiTheme="minorHAnsi" w:eastAsia="Courier New" w:hAnsiTheme="minorHAnsi"/>
-          <w:sz w:val="22"/>
-          <w:szCs w:val="22"/>
-        </w:rPr>
-        <w:t>[01:</w:t>
-      </w:r>
-      <w:r>
-        <w:rPr>
-          <w:rFonts w:asciiTheme="minorHAnsi" w:eastAsia="Courier New" w:hAnsiTheme="minorHAnsi"/>
-          <w:sz w:val="22"/>
-          <w:szCs w:val="22"/>
-        </w:rPr>
-        <w:t>19</w:t>
-      </w:r>
-      <w:r>
-        <w:rPr>
-          <w:rFonts w:asciiTheme="minorHAnsi" w:eastAsia="Courier New" w:hAnsiTheme="minorHAnsi"/>
-          <w:sz w:val="22"/>
-          <w:szCs w:val="22"/>
-        </w:rPr>
-        <w:t>–0</w:t>
-      </w:r>
-      <w:r>
-        <w:rPr>
-          <w:rFonts w:asciiTheme="minorHAnsi" w:eastAsia="Courier New" w:hAnsiTheme="minorHAnsi"/>
-          <w:sz w:val="22"/>
-          <w:szCs w:val="22"/>
-        </w:rPr>
-        <w:t>2</w:t>
-      </w:r>
-      <w:r>
-        <w:rPr>
-          <w:rFonts w:asciiTheme="minorHAnsi" w:eastAsia="Courier New" w:hAnsiTheme="minorHAnsi"/>
-          <w:sz w:val="22"/>
-          <w:szCs w:val="22"/>
-        </w:rPr>
-        <w:t>:</w:t>
-      </w:r>
-      <w:r>
-        <w:rPr>
-          <w:rFonts w:asciiTheme="minorHAnsi" w:eastAsia="Courier New" w:hAnsiTheme="minorHAnsi"/>
-          <w:sz w:val="22"/>
-          <w:szCs w:val="22"/>
-        </w:rPr>
-        <w:t>27</w:t>
-      </w:r>
-      <w:r>
-        <w:rPr>
-          <w:rFonts w:asciiTheme="minorHAnsi" w:eastAsia="Courier New" w:hAnsiTheme="minorHAnsi"/>
-          <w:sz w:val="22"/>
-          <w:szCs w:val="22"/>
-        </w:rPr>
-        <w:t>]</w:t>
+        <w:t xml:space="preserve"> [01:19–02:27]</w:t>
       </w:r>
       <w:r>
         <w:rPr>
@@ -3943,13 +3990,23 @@
           <w:szCs w:val="22"/>
         </w:rPr>
       </w:pPr>
-      <w:r>
-        <w:rPr>
-          <w:rFonts w:asciiTheme="minorHAnsi" w:hAnsiTheme="minorHAnsi"/>
-          <w:sz w:val="22"/>
-          <w:szCs w:val="22"/>
-        </w:rPr>
-        <w:t>Double-collection prevented by authority guard</w:t>
+      <w:proofErr w:type="gramStart"/>
+      <w:r>
+        <w:rPr>
+          <w:rFonts w:asciiTheme="minorHAnsi" w:hAnsiTheme="minorHAnsi"/>
+          <w:sz w:val="22"/>
+          <w:szCs w:val="22"/>
+        </w:rPr>
+        <w:t>Double-collection</w:t>
+      </w:r>
+      <w:proofErr w:type="gramEnd"/>
+      <w:r>
+        <w:rPr>
+          <w:rFonts w:asciiTheme="minorHAnsi" w:hAnsiTheme="minorHAnsi"/>
+          <w:sz w:val="22"/>
+          <w:szCs w:val="22"/>
+        </w:rPr>
+        <w:t xml:space="preserve"> prevented by authority guard</w:t>
       </w:r>
     </w:p>
     <w:p>
@@ -4216,13 +4273,23 @@
           <w:szCs w:val="22"/>
         </w:rPr>
       </w:pPr>
-      <w:r>
-        <w:rPr>
-          <w:rFonts w:asciiTheme="minorHAnsi" w:hAnsiTheme="minorHAnsi"/>
-          <w:sz w:val="22"/>
-          <w:szCs w:val="22"/>
-        </w:rPr>
-        <w:t>Double-voting prevented</w:t>
+      <w:proofErr w:type="gramStart"/>
+      <w:r>
+        <w:rPr>
+          <w:rFonts w:asciiTheme="minorHAnsi" w:hAnsiTheme="minorHAnsi"/>
+          <w:sz w:val="22"/>
+          <w:szCs w:val="22"/>
+        </w:rPr>
+        <w:t>Double-voting</w:t>
+      </w:r>
+      <w:proofErr w:type="gramEnd"/>
+      <w:r>
+        <w:rPr>
+          <w:rFonts w:asciiTheme="minorHAnsi" w:hAnsiTheme="minorHAnsi"/>
+          <w:sz w:val="22"/>
+          <w:szCs w:val="22"/>
+        </w:rPr>
+        <w:t xml:space="preserve"> prevented</w:t>
       </w:r>
     </w:p>
     <w:p>
@@ -5380,15 +5447,7 @@
           <w:sz w:val="22"/>
           <w:szCs w:val="22"/>
         </w:rPr>
-        <w:t xml:space="preserve"> model enforces strict client-server separation by design, while Fusion Shared Mode requires more deliberate authority discipline to ensure peers do not conflict.</w:t>
-      </w:r>
-      <w:r>
-        <w:rPr>
-          <w:rFonts w:asciiTheme="minorHAnsi" w:hAnsiTheme="minorHAnsi"/>
-          <w:sz w:val="22"/>
-          <w:szCs w:val="22"/>
-        </w:rPr>
-        <w:t xml:space="preserve"> </w:t>
+        <w:t xml:space="preserve"> model enforces strict client-server separation by design, while Fusion Shared Mode requires more deliberate authority discipline to ensure peers do not conflict. </w:t>
       </w:r>
     </w:p>
     <w:p>
@@ -5682,6 +5741,7 @@
         </w:rPr>
         <w:t>Consistent commit message convention (</w:t>
       </w:r>
+      <w:proofErr w:type="gramStart"/>
       <w:r>
         <w:rPr>
           <w:rFonts w:asciiTheme="minorHAnsi" w:eastAsia="Courier New" w:hAnsiTheme="minorHAnsi"/>
@@ -5696,8 +5756,18 @@
           <w:sz w:val="22"/>
           <w:szCs w:val="22"/>
         </w:rPr>
-        <w:t xml:space="preserve">, </w:t>
-      </w:r>
+        <w:t>,</w:t>
+      </w:r>
+      <w:proofErr w:type="gramEnd"/>
+      <w:r>
+        <w:rPr>
+          <w:rFonts w:asciiTheme="minorHAnsi" w:hAnsiTheme="minorHAnsi"/>
+          <w:sz w:val="22"/>
+          <w:szCs w:val="22"/>
+        </w:rPr>
+        <w:t xml:space="preserve"> </w:t>
+      </w:r>
+      <w:proofErr w:type="gramStart"/>
       <w:r>
         <w:rPr>
           <w:rFonts w:asciiTheme="minorHAnsi" w:eastAsia="Courier New" w:hAnsiTheme="minorHAnsi"/>
@@ -5712,8 +5782,18 @@
           <w:sz w:val="22"/>
           <w:szCs w:val="22"/>
         </w:rPr>
-        <w:t xml:space="preserve">, </w:t>
-      </w:r>
+        <w:t>,</w:t>
+      </w:r>
+      <w:proofErr w:type="gramEnd"/>
+      <w:r>
+        <w:rPr>
+          <w:rFonts w:asciiTheme="minorHAnsi" w:hAnsiTheme="minorHAnsi"/>
+          <w:sz w:val="22"/>
+          <w:szCs w:val="22"/>
+        </w:rPr>
+        <w:t xml:space="preserve"> </w:t>
+      </w:r>
+      <w:proofErr w:type="gramStart"/>
       <w:r>
         <w:rPr>
           <w:rFonts w:asciiTheme="minorHAnsi" w:eastAsia="Courier New" w:hAnsiTheme="minorHAnsi"/>
@@ -5728,7 +5808,16 @@
           <w:sz w:val="22"/>
           <w:szCs w:val="22"/>
         </w:rPr>
-        <w:t xml:space="preserve">, </w:t>
+        <w:t>,</w:t>
+      </w:r>
+      <w:proofErr w:type="gramEnd"/>
+      <w:r>
+        <w:rPr>
+          <w:rFonts w:asciiTheme="minorHAnsi" w:hAnsiTheme="minorHAnsi"/>
+          <w:sz w:val="22"/>
+          <w:szCs w:val="22"/>
+        </w:rPr>
+        <w:t xml:space="preserve"> </w:t>
       </w:r>
       <w:r>
         <w:rPr>
@@ -6201,6 +6290,61 @@
           <w:rFonts w:asciiTheme="minorHAnsi" w:hAnsiTheme="minorHAnsi"/>
         </w:rPr>
       </w:pPr>
+      <w:r>
+        <w:rPr>
+          <w:rFonts w:asciiTheme="minorHAnsi" w:hAnsiTheme="minorHAnsi"/>
+          <w:noProof/>
+        </w:rPr>
+        <w:lastRenderedPageBreak/>
+        <w:drawing>
+          <wp:inline distT="0" distB="0" distL="0" distR="0" wp14:anchorId="4024B5D1" wp14:editId="5F9A9DB7">
+            <wp:extent cx="5725795" cy="2967990"/>
+            <wp:effectExtent l="0" t="0" r="8255" b="3810"/>
+            <wp:docPr id="1186420748" name="Picture 2"/>
+            <wp:cNvGraphicFramePr>
+              <a:graphicFrameLocks xmlns:a="http://schemas.openxmlformats.org/drawingml/2006/main" noChangeAspect="1"/>
+            </wp:cNvGraphicFramePr>
+            <a:graphic xmlns:a="http://schemas.openxmlformats.org/drawingml/2006/main">
+              <a:graphicData uri="http://schemas.openxmlformats.org/drawingml/2006/picture">
+                <pic:pic xmlns:pic="http://schemas.openxmlformats.org/drawingml/2006/picture">
+                  <pic:nvPicPr>
+                    <pic:cNvPr id="0" name="Picture 2"/>
+                    <pic:cNvPicPr>
+                      <a:picLocks noChangeAspect="1" noChangeArrowheads="1"/>
+                    </pic:cNvPicPr>
+                  </pic:nvPicPr>
+                  <pic:blipFill>
+                    <a:blip r:embed="rId15" cstate="print">
+                      <a:extLst>
+                        <a:ext uri="{28A0092B-C50C-407E-A947-70E740481C1C}">
+                          <a14:useLocalDpi xmlns:a14="http://schemas.microsoft.com/office/drawing/2010/main" val="0"/>
+                        </a:ext>
+                      </a:extLst>
+                    </a:blip>
+                    <a:srcRect/>
+                    <a:stretch>
+                      <a:fillRect/>
+                    </a:stretch>
+                  </pic:blipFill>
+                  <pic:spPr bwMode="auto">
+                    <a:xfrm>
+                      <a:off x="0" y="0"/>
+                      <a:ext cx="5725795" cy="2967990"/>
+                    </a:xfrm>
+                    <a:prstGeom prst="rect">
+                      <a:avLst/>
+                    </a:prstGeom>
+                    <a:noFill/>
+                    <a:ln>
+                      <a:noFill/>
+                    </a:ln>
+                  </pic:spPr>
+                </pic:pic>
+              </a:graphicData>
+            </a:graphic>
+          </wp:inline>
+        </w:drawing>
+      </w:r>
     </w:p>
     <w:p>
       <w:pPr>
@@ -6327,7 +6471,6 @@
           <w:sz w:val="22"/>
           <w:szCs w:val="22"/>
         </w:rPr>
-        <w:lastRenderedPageBreak/>
         <w:t>One branch per milestone or coherent feature</w:t>
       </w:r>
     </w:p>
@@ -6374,6 +6517,7 @@
         </w:rPr>
         <w:t>Commit message prefix convention (</w:t>
       </w:r>
+      <w:proofErr w:type="gramStart"/>
       <w:r>
         <w:rPr>
           <w:rFonts w:asciiTheme="minorHAnsi" w:eastAsia="Courier New" w:hAnsiTheme="minorHAnsi"/>
@@ -6388,8 +6532,18 @@
           <w:sz w:val="22"/>
           <w:szCs w:val="22"/>
         </w:rPr>
-        <w:t xml:space="preserve">, </w:t>
-      </w:r>
+        <w:t>,</w:t>
+      </w:r>
+      <w:proofErr w:type="gramEnd"/>
+      <w:r>
+        <w:rPr>
+          <w:rFonts w:asciiTheme="minorHAnsi" w:hAnsiTheme="minorHAnsi"/>
+          <w:sz w:val="22"/>
+          <w:szCs w:val="22"/>
+        </w:rPr>
+        <w:t xml:space="preserve"> </w:t>
+      </w:r>
+      <w:proofErr w:type="gramStart"/>
       <w:r>
         <w:rPr>
           <w:rFonts w:asciiTheme="minorHAnsi" w:eastAsia="Courier New" w:hAnsiTheme="minorHAnsi"/>
@@ -6404,8 +6558,18 @@
           <w:sz w:val="22"/>
           <w:szCs w:val="22"/>
         </w:rPr>
-        <w:t xml:space="preserve">, </w:t>
-      </w:r>
+        <w:t>,</w:t>
+      </w:r>
+      <w:proofErr w:type="gramEnd"/>
+      <w:r>
+        <w:rPr>
+          <w:rFonts w:asciiTheme="minorHAnsi" w:hAnsiTheme="minorHAnsi"/>
+          <w:sz w:val="22"/>
+          <w:szCs w:val="22"/>
+        </w:rPr>
+        <w:t xml:space="preserve"> </w:t>
+      </w:r>
+      <w:proofErr w:type="gramStart"/>
       <w:r>
         <w:rPr>
           <w:rFonts w:asciiTheme="minorHAnsi" w:eastAsia="Courier New" w:hAnsiTheme="minorHAnsi"/>
@@ -6420,8 +6584,18 @@
           <w:sz w:val="22"/>
           <w:szCs w:val="22"/>
         </w:rPr>
-        <w:t xml:space="preserve">, </w:t>
-      </w:r>
+        <w:t>,</w:t>
+      </w:r>
+      <w:proofErr w:type="gramEnd"/>
+      <w:r>
+        <w:rPr>
+          <w:rFonts w:asciiTheme="minorHAnsi" w:hAnsiTheme="minorHAnsi"/>
+          <w:sz w:val="22"/>
+          <w:szCs w:val="22"/>
+        </w:rPr>
+        <w:t xml:space="preserve"> </w:t>
+      </w:r>
+      <w:proofErr w:type="gramStart"/>
       <w:r>
         <w:rPr>
           <w:rFonts w:asciiTheme="minorHAnsi" w:eastAsia="Courier New" w:hAnsiTheme="minorHAnsi"/>
@@ -6436,7 +6610,16 @@
           <w:sz w:val="22"/>
           <w:szCs w:val="22"/>
         </w:rPr>
-        <w:t xml:space="preserve">, </w:t>
+        <w:t>,</w:t>
+      </w:r>
+      <w:proofErr w:type="gramEnd"/>
+      <w:r>
+        <w:rPr>
+          <w:rFonts w:asciiTheme="minorHAnsi" w:hAnsiTheme="minorHAnsi"/>
+          <w:sz w:val="22"/>
+          <w:szCs w:val="22"/>
+        </w:rPr>
+        <w:t xml:space="preserve"> </w:t>
       </w:r>
       <w:r>
         <w:rPr>
@@ -6702,6 +6885,7 @@
           <w:sz w:val="22"/>
           <w:szCs w:val="22"/>
         </w:rPr>
+        <w:lastRenderedPageBreak/>
         <w:t xml:space="preserve">See: </w:t>
       </w:r>
       <w:r>
@@ -7296,7 +7480,25 @@
                 <w:sz w:val="22"/>
                 <w:szCs w:val="22"/>
               </w:rPr>
-              <w:t>UE5 dissolve replication; Unity lighting (dusk); Post-processing; CA1 packaging.</w:t>
+              <w:t xml:space="preserve">UE5 dissolve replication; Unity lighting (dusk); </w:t>
+            </w:r>
+            <w:proofErr w:type="gramStart"/>
+            <w:r>
+              <w:rPr>
+                <w:rFonts w:asciiTheme="minorHAnsi" w:hAnsiTheme="minorHAnsi"/>
+                <w:sz w:val="22"/>
+                <w:szCs w:val="22"/>
+              </w:rPr>
+              <w:t>Post-processing</w:t>
+            </w:r>
+            <w:proofErr w:type="gramEnd"/>
+            <w:r>
+              <w:rPr>
+                <w:rFonts w:asciiTheme="minorHAnsi" w:hAnsiTheme="minorHAnsi"/>
+                <w:sz w:val="22"/>
+                <w:szCs w:val="22"/>
+              </w:rPr>
+              <w:t>; CA1 packaging.</w:t>
             </w:r>
           </w:p>
         </w:tc>
@@ -7473,16 +7675,7 @@
                 <w:sz w:val="22"/>
                 <w:szCs w:val="22"/>
               </w:rPr>
-              <w:t xml:space="preserve">6607ae5, fba1c3a, </w:t>
-            </w:r>
-            <w:r>
-              <w:rPr>
-                <w:rFonts w:asciiTheme="minorHAnsi" w:hAnsiTheme="minorHAnsi"/>
-                <w:sz w:val="22"/>
-                <w:szCs w:val="22"/>
-              </w:rPr>
-              <w:lastRenderedPageBreak/>
-              <w:t>cf34910, 4a1e819</w:t>
+              <w:t>6607ae5, fba1c3a, cf34910, 4a1e819</w:t>
             </w:r>
           </w:p>
         </w:tc>
@@ -7507,7 +7700,6 @@
                 <w:sz w:val="22"/>
                 <w:szCs w:val="22"/>
               </w:rPr>
-              <w:lastRenderedPageBreak/>
               <w:t>Rendering Profiling Pack.docx, constraints.md</w:t>
             </w:r>
           </w:p>
@@ -7533,16 +7725,7 @@
                 <w:sz w:val="22"/>
                 <w:szCs w:val="22"/>
               </w:rPr>
-              <w:t xml:space="preserve">Single-mesh fan asset; generated LODs in </w:t>
-            </w:r>
-            <w:r>
-              <w:rPr>
-                <w:rFonts w:asciiTheme="minorHAnsi" w:hAnsiTheme="minorHAnsi"/>
-                <w:sz w:val="22"/>
-                <w:szCs w:val="22"/>
-              </w:rPr>
-              <w:lastRenderedPageBreak/>
-              <w:t>Blender via Decimate.</w:t>
+              <w:t>Single-mesh fan asset; generated LODs in Blender via Decimate.</w:t>
             </w:r>
           </w:p>
         </w:tc>
@@ -7572,7 +7755,6 @@
                 <w:sz w:val="22"/>
                 <w:szCs w:val="22"/>
               </w:rPr>
-              <w:lastRenderedPageBreak/>
               <w:t>9</w:t>
             </w:r>
           </w:p>
@@ -8067,7 +8249,16 @@
                 <w:sz w:val="22"/>
                 <w:szCs w:val="22"/>
               </w:rPr>
-              <w:t>28–29 Mar 2026</w:t>
+              <w:t xml:space="preserve">28–29 </w:t>
+            </w:r>
+            <w:r>
+              <w:rPr>
+                <w:rFonts w:asciiTheme="minorHAnsi" w:hAnsiTheme="minorHAnsi"/>
+                <w:sz w:val="22"/>
+                <w:szCs w:val="22"/>
+              </w:rPr>
+              <w:lastRenderedPageBreak/>
+              <w:t>Mar 2026</w:t>
             </w:r>
           </w:p>
         </w:tc>
@@ -8092,7 +8283,17 @@
                 <w:sz w:val="22"/>
                 <w:szCs w:val="22"/>
               </w:rPr>
-              <w:t>Lobby &amp; Room browser; RPC Emote system (Wave/Cheer/Taunt) with speech bubbles.</w:t>
+              <w:lastRenderedPageBreak/>
+              <w:t xml:space="preserve">Lobby &amp; Room browser; RPC Emote system </w:t>
+            </w:r>
+            <w:r>
+              <w:rPr>
+                <w:rFonts w:asciiTheme="minorHAnsi" w:hAnsiTheme="minorHAnsi"/>
+                <w:sz w:val="22"/>
+                <w:szCs w:val="22"/>
+              </w:rPr>
+              <w:lastRenderedPageBreak/>
+              <w:t>(Wave/Cheer/Taunt) with speech bubbles.</w:t>
             </w:r>
           </w:p>
         </w:tc>
@@ -8117,7 +8318,17 @@
                 <w:sz w:val="22"/>
                 <w:szCs w:val="22"/>
               </w:rPr>
-              <w:t>23b3670, 8fd4c3e, 0bd7503, 11002b6</w:t>
+              <w:lastRenderedPageBreak/>
+              <w:t xml:space="preserve">23b3670, 8fd4c3e, </w:t>
+            </w:r>
+            <w:r>
+              <w:rPr>
+                <w:rFonts w:asciiTheme="minorHAnsi" w:hAnsiTheme="minorHAnsi"/>
+                <w:sz w:val="22"/>
+                <w:szCs w:val="22"/>
+              </w:rPr>
+              <w:lastRenderedPageBreak/>
+              <w:t>0bd7503, 11002b6</w:t>
             </w:r>
           </w:p>
         </w:tc>
@@ -8142,6 +8353,7 @@
                 <w:sz w:val="22"/>
                 <w:szCs w:val="22"/>
               </w:rPr>
+              <w:lastRenderedPageBreak/>
               <w:t>w8-a_lobby.md, w8-b_rpc_emotes.md</w:t>
             </w:r>
           </w:p>
@@ -8185,7 +8397,16 @@
                 <w:sz w:val="22"/>
                 <w:szCs w:val="22"/>
               </w:rPr>
-              <w:t xml:space="preserve"> for UI; Emote bubble timing issues (fixed in Spawned).</w:t>
+              <w:t xml:space="preserve"> for UI; Emote </w:t>
+            </w:r>
+            <w:r>
+              <w:rPr>
+                <w:rFonts w:asciiTheme="minorHAnsi" w:hAnsiTheme="minorHAnsi"/>
+                <w:sz w:val="22"/>
+                <w:szCs w:val="22"/>
+              </w:rPr>
+              <w:lastRenderedPageBreak/>
+              <w:t>bubble timing issues (fixed in Spawned).</w:t>
             </w:r>
           </w:p>
         </w:tc>
@@ -8616,39 +8837,70 @@
           <w:rFonts w:asciiTheme="majorHAnsi" w:hAnsiTheme="majorHAnsi"/>
           <w:color w:val="156082" w:themeColor="accent1"/>
         </w:rPr>
-        <w:t>Section 2:</w:t>
-      </w:r>
-      <w:r>
+        <w:t>Section 2: Critical Discussion of Technical Choices</w:t>
+      </w:r>
+    </w:p>
+    <w:p>
+      <w:pPr>
+        <w:rPr>
+          <w:rFonts w:asciiTheme="minorHAnsi" w:hAnsiTheme="minorHAnsi"/>
+          <w:sz w:val="22"/>
+          <w:szCs w:val="22"/>
+        </w:rPr>
+      </w:pPr>
+      <w:r>
+        <w:rPr>
+          <w:rFonts w:asciiTheme="minorHAnsi" w:hAnsiTheme="minorHAnsi"/>
+          <w:sz w:val="22"/>
+          <w:szCs w:val="22"/>
+        </w:rPr>
+        <w:t xml:space="preserve">See: </w:t>
+      </w:r>
+      <w:r>
+        <w:rPr>
+          <w:rFonts w:asciiTheme="minorHAnsi" w:eastAsia="Courier New" w:hAnsiTheme="minorHAnsi"/>
+          <w:sz w:val="22"/>
+          <w:szCs w:val="22"/>
+        </w:rPr>
+        <w:t>Docs/CA2_LearningJournal.md</w:t>
+      </w:r>
+    </w:p>
+    <w:p>
+      <w:pPr>
+        <w:spacing w:after="200"/>
+        <w:rPr>
+          <w:rFonts w:asciiTheme="minorHAnsi" w:hAnsiTheme="minorHAnsi"/>
+        </w:rPr>
+      </w:pPr>
+      <w:r>
+        <w:rPr>
+          <w:rFonts w:asciiTheme="minorHAnsi" w:hAnsiTheme="minorHAnsi"/>
+        </w:rPr>
+        <w:t xml:space="preserve"> </w:t>
+      </w:r>
+    </w:p>
+    <w:p>
+      <w:pPr>
+        <w:pStyle w:val="Heading4"/>
+        <w:spacing w:after="200"/>
         <w:rPr>
           <w:rFonts w:asciiTheme="majorHAnsi" w:hAnsiTheme="majorHAnsi"/>
           <w:color w:val="156082" w:themeColor="accent1"/>
         </w:rPr>
-        <w:t xml:space="preserve"> Critical Discussion of Technical Choices</w:t>
-      </w:r>
-    </w:p>
-    <w:p>
-      <w:pPr>
-        <w:rPr>
-          <w:rFonts w:asciiTheme="minorHAnsi" w:hAnsiTheme="minorHAnsi"/>
-          <w:sz w:val="22"/>
-          <w:szCs w:val="22"/>
-        </w:rPr>
-      </w:pPr>
-      <w:r>
-        <w:rPr>
-          <w:rFonts w:asciiTheme="minorHAnsi" w:hAnsiTheme="minorHAnsi"/>
-          <w:sz w:val="22"/>
-          <w:szCs w:val="22"/>
-        </w:rPr>
-        <w:t xml:space="preserve">See: </w:t>
-      </w:r>
-      <w:r>
-        <w:rPr>
-          <w:rFonts w:asciiTheme="minorHAnsi" w:eastAsia="Courier New" w:hAnsiTheme="minorHAnsi"/>
-          <w:sz w:val="22"/>
-          <w:szCs w:val="22"/>
-        </w:rPr>
-        <w:t>Docs/CA2_LearningJournal.md</w:t>
+      </w:pPr>
+      <w:r>
+        <w:rPr>
+          <w:rFonts w:asciiTheme="majorHAnsi" w:hAnsiTheme="majorHAnsi"/>
+          <w:color w:val="156082" w:themeColor="accent1"/>
+        </w:rPr>
+        <w:t xml:space="preserve">1. </w:t>
+      </w:r>
+      <w:r>
+        <w:rPr>
+          <w:rFonts w:asciiTheme="majorHAnsi" w:hAnsiTheme="majorHAnsi"/>
+          <w:color w:val="156082" w:themeColor="accent1"/>
+        </w:rPr>
+        <w:t>Why I chose this feature scope</w:t>
       </w:r>
     </w:p>
     <w:p>
@@ -8656,13 +8908,95 @@
         <w:spacing w:after="200"/>
         <w:rPr>
           <w:rFonts w:asciiTheme="minorHAnsi" w:hAnsiTheme="minorHAnsi"/>
-        </w:rPr>
-      </w:pPr>
-      <w:r>
-        <w:rPr>
-          <w:rFonts w:asciiTheme="minorHAnsi" w:hAnsiTheme="minorHAnsi"/>
+          <w:sz w:val="22"/>
+          <w:szCs w:val="22"/>
+        </w:rPr>
+      </w:pPr>
+      <w:r>
+        <w:rPr>
+          <w:rFonts w:asciiTheme="minorHAnsi" w:hAnsiTheme="minorHAnsi"/>
+          <w:sz w:val="22"/>
+          <w:szCs w:val="22"/>
+        </w:rPr>
+        <w:t>The big deciding factor for the features I decided to implement for this CA was the lab work. By Week 8 the foundation already included a working Fusion Shared Mode session with KCC character movement, Unity Player Account authentication, a lobby browser, room creation and joining, player name tags, and an RPC emote system. It was only a matter of using this foundation and building up from it. This is why I decided to go for Options B and C since they both fit naturally into the Shared Mode authority model we had already been working with.</w:t>
+      </w:r>
+    </w:p>
+    <w:p>
+      <w:pPr>
+        <w:spacing w:after="200"/>
+        <w:rPr>
+          <w:rFonts w:asciiTheme="minorHAnsi" w:hAnsiTheme="minorHAnsi"/>
+          <w:sz w:val="22"/>
+          <w:szCs w:val="22"/>
+        </w:rPr>
+      </w:pPr>
+    </w:p>
+    <w:p>
+      <w:pPr>
+        <w:spacing w:after="200"/>
+        <w:rPr>
+          <w:rFonts w:asciiTheme="minorHAnsi" w:hAnsiTheme="minorHAnsi"/>
+          <w:sz w:val="22"/>
+          <w:szCs w:val="22"/>
+        </w:rPr>
+      </w:pPr>
+      <w:r>
+        <w:rPr>
+          <w:rFonts w:asciiTheme="minorHAnsi" w:hAnsiTheme="minorHAnsi"/>
+          <w:sz w:val="22"/>
+          <w:szCs w:val="22"/>
+        </w:rPr>
+        <w:t>I tackled Option C first, a networked countdown timer, since it felt like a manageable starting point that could immediately demonstrate the [Networked] property pattern across two clients. From there I added Option B, a scoring system using collectible orbs, which then enhanced Option C by giving the round a meaningful outcome, a win state based on who collected the most points.</w:t>
+      </w:r>
+    </w:p>
+    <w:p>
+      <w:pPr>
+        <w:spacing w:after="200"/>
+        <w:rPr>
+          <w:rFonts w:asciiTheme="minorHAnsi" w:hAnsiTheme="minorHAnsi"/>
+          <w:sz w:val="22"/>
+          <w:szCs w:val="22"/>
+        </w:rPr>
+      </w:pPr>
+    </w:p>
+    <w:p>
+      <w:pPr>
+        <w:spacing w:after="200"/>
+        <w:rPr>
+          <w:rFonts w:asciiTheme="minorHAnsi" w:hAnsiTheme="minorHAnsi"/>
+          <w:sz w:val="22"/>
+          <w:szCs w:val="22"/>
+        </w:rPr>
+      </w:pPr>
+      <w:r>
+        <w:rPr>
+          <w:rFonts w:asciiTheme="minorHAnsi" w:hAnsiTheme="minorHAnsi"/>
+          <w:sz w:val="22"/>
+          <w:szCs w:val="22"/>
+        </w:rPr>
+        <w:t xml:space="preserve">I deliberately left out Options A and D. Option A, server-authoritative character movement, would have required switching from Shared Mode to a server or host topology, which would have meant reimplementing the session management and authority model from scratch. Option D, networked projectiles, has similar requirements and introduces hit detection complexity that wasn't covered in the labs. Both were technically interesting but would have </w:t>
+      </w:r>
+      <w:r>
+        <w:rPr>
+          <w:rFonts w:asciiTheme="minorHAnsi" w:hAnsiTheme="minorHAnsi"/>
+          <w:sz w:val="22"/>
+          <w:szCs w:val="22"/>
         </w:rPr>
         <w:lastRenderedPageBreak/>
+        <w:t>taken longer than the time allowed and risked producing something unstable rather than a smaller, well-tested feature.</w:t>
+      </w:r>
+    </w:p>
+    <w:p>
+      <w:pPr>
+        <w:spacing w:after="200"/>
+        <w:rPr>
+          <w:rFonts w:asciiTheme="minorHAnsi" w:hAnsiTheme="minorHAnsi"/>
+        </w:rPr>
+      </w:pPr>
+      <w:r>
+        <w:rPr>
+          <w:rFonts w:asciiTheme="minorHAnsi" w:hAnsiTheme="minorHAnsi"/>
+        </w:rPr>
         <w:t xml:space="preserve"> </w:t>
       </w:r>
     </w:p>
@@ -8680,162 +9014,585 @@
           <w:rFonts w:asciiTheme="majorHAnsi" w:hAnsiTheme="majorHAnsi"/>
           <w:color w:val="156082" w:themeColor="accent1"/>
         </w:rPr>
-        <w:t xml:space="preserve">1. </w:t>
-      </w:r>
-      <w:r>
+        <w:t>2. [Networked] Property vs RPC</w:t>
+      </w:r>
+    </w:p>
+    <w:p>
+      <w:pPr>
+        <w:rPr>
+          <w:rFonts w:asciiTheme="minorHAnsi" w:hAnsiTheme="minorHAnsi"/>
+          <w:sz w:val="22"/>
+          <w:szCs w:val="22"/>
+        </w:rPr>
+      </w:pPr>
+      <w:r>
+        <w:rPr>
+          <w:rFonts w:asciiTheme="minorHAnsi" w:hAnsiTheme="minorHAnsi"/>
+          <w:sz w:val="22"/>
+          <w:szCs w:val="22"/>
+        </w:rPr>
+        <w:t>I made use of several [Networked] properties and RPCs in this project, and the distinction between the two became clear through implementation.</w:t>
+      </w:r>
+    </w:p>
+    <w:p>
+      <w:pPr>
+        <w:rPr>
+          <w:rFonts w:asciiTheme="minorHAnsi" w:hAnsiTheme="minorHAnsi"/>
+          <w:sz w:val="22"/>
+          <w:szCs w:val="22"/>
+        </w:rPr>
+      </w:pPr>
+    </w:p>
+    <w:p>
+      <w:pPr>
+        <w:rPr>
+          <w:rFonts w:asciiTheme="minorHAnsi" w:hAnsiTheme="minorHAnsi"/>
+          <w:sz w:val="22"/>
+          <w:szCs w:val="22"/>
+        </w:rPr>
+      </w:pPr>
+      <w:r>
+        <w:rPr>
+          <w:rFonts w:asciiTheme="minorHAnsi" w:hAnsiTheme="minorHAnsi"/>
+          <w:sz w:val="22"/>
+          <w:szCs w:val="22"/>
+        </w:rPr>
+        <w:t xml:space="preserve">[Networked] properties are used for persistent state — values that any client needs to be correct at any point regardless of when they joined the session. </w:t>
+      </w:r>
+      <w:proofErr w:type="spellStart"/>
+      <w:r>
+        <w:rPr>
+          <w:rFonts w:asciiTheme="minorHAnsi" w:hAnsiTheme="minorHAnsi"/>
+          <w:sz w:val="22"/>
+          <w:szCs w:val="22"/>
+        </w:rPr>
+        <w:t>TimeRemaining</w:t>
+      </w:r>
+      <w:proofErr w:type="spellEnd"/>
+      <w:r>
+        <w:rPr>
+          <w:rFonts w:asciiTheme="minorHAnsi" w:hAnsiTheme="minorHAnsi"/>
+          <w:sz w:val="22"/>
+          <w:szCs w:val="22"/>
+        </w:rPr>
+        <w:t xml:space="preserve">, Phase, Winner, </w:t>
+      </w:r>
+      <w:proofErr w:type="spellStart"/>
+      <w:r>
+        <w:rPr>
+          <w:rFonts w:asciiTheme="minorHAnsi" w:hAnsiTheme="minorHAnsi"/>
+          <w:sz w:val="22"/>
+          <w:szCs w:val="22"/>
+        </w:rPr>
+        <w:t>RematchVotes</w:t>
+      </w:r>
+      <w:proofErr w:type="spellEnd"/>
+      <w:r>
+        <w:rPr>
+          <w:rFonts w:asciiTheme="minorHAnsi" w:hAnsiTheme="minorHAnsi"/>
+          <w:sz w:val="22"/>
+          <w:szCs w:val="22"/>
+        </w:rPr>
+        <w:t>, and Score are all persistent because a client joining mid-round must immediately see the correct timer, the correct phase, and the correct scores without any event needing to be replayed. Fusion includes these in the initial state snapshot automatically so late joiners are never out of sync.</w:t>
+      </w:r>
+    </w:p>
+    <w:p>
+      <w:pPr>
+        <w:rPr>
+          <w:rFonts w:asciiTheme="minorHAnsi" w:hAnsiTheme="minorHAnsi"/>
+          <w:sz w:val="22"/>
+          <w:szCs w:val="22"/>
+        </w:rPr>
+      </w:pPr>
+    </w:p>
+    <w:p>
+      <w:pPr>
+        <w:rPr>
+          <w:rFonts w:asciiTheme="minorHAnsi" w:hAnsiTheme="minorHAnsi"/>
+          <w:sz w:val="22"/>
+          <w:szCs w:val="22"/>
+        </w:rPr>
+      </w:pPr>
+      <w:r>
+        <w:rPr>
+          <w:rFonts w:asciiTheme="minorHAnsi" w:hAnsiTheme="minorHAnsi"/>
+          <w:sz w:val="22"/>
+          <w:szCs w:val="22"/>
+        </w:rPr>
+        <w:t xml:space="preserve">RPCs are the right tool for one-shot events that do not need to be preserved. </w:t>
+      </w:r>
+      <w:proofErr w:type="spellStart"/>
+      <w:r>
+        <w:rPr>
+          <w:rFonts w:asciiTheme="minorHAnsi" w:hAnsiTheme="minorHAnsi"/>
+          <w:sz w:val="22"/>
+          <w:szCs w:val="22"/>
+        </w:rPr>
+        <w:t>Rpc_GameOver</w:t>
+      </w:r>
+      <w:proofErr w:type="spellEnd"/>
+      <w:r>
+        <w:rPr>
+          <w:rFonts w:asciiTheme="minorHAnsi" w:hAnsiTheme="minorHAnsi"/>
+          <w:sz w:val="22"/>
+          <w:szCs w:val="22"/>
+        </w:rPr>
+        <w:t xml:space="preserve"> starts once when the timer hits zero — a late-joining client does not need to receive it because Phase == </w:t>
+      </w:r>
+      <w:proofErr w:type="spellStart"/>
+      <w:r>
+        <w:rPr>
+          <w:rFonts w:asciiTheme="minorHAnsi" w:hAnsiTheme="minorHAnsi"/>
+          <w:sz w:val="22"/>
+          <w:szCs w:val="22"/>
+        </w:rPr>
+        <w:t>GameOver</w:t>
+      </w:r>
+      <w:proofErr w:type="spellEnd"/>
+      <w:r>
+        <w:rPr>
+          <w:rFonts w:asciiTheme="minorHAnsi" w:hAnsiTheme="minorHAnsi"/>
+          <w:sz w:val="22"/>
+          <w:szCs w:val="22"/>
+        </w:rPr>
+        <w:t xml:space="preserve"> in the state snapshot already communicates that the round has ended. </w:t>
+      </w:r>
+      <w:proofErr w:type="spellStart"/>
+      <w:r>
+        <w:rPr>
+          <w:rFonts w:asciiTheme="minorHAnsi" w:hAnsiTheme="minorHAnsi"/>
+          <w:sz w:val="22"/>
+          <w:szCs w:val="22"/>
+        </w:rPr>
+        <w:t>Rpc_PlayEmote</w:t>
+      </w:r>
+      <w:proofErr w:type="spellEnd"/>
+      <w:r>
+        <w:rPr>
+          <w:rFonts w:asciiTheme="minorHAnsi" w:hAnsiTheme="minorHAnsi"/>
+          <w:sz w:val="22"/>
+          <w:szCs w:val="22"/>
+        </w:rPr>
+        <w:t xml:space="preserve"> starts once per keypress — there is no meaningful "current emote" state to store. If I had used a [Networked] string for the </w:t>
+      </w:r>
+      <w:proofErr w:type="gramStart"/>
+      <w:r>
+        <w:rPr>
+          <w:rFonts w:asciiTheme="minorHAnsi" w:hAnsiTheme="minorHAnsi"/>
+          <w:sz w:val="22"/>
+          <w:szCs w:val="22"/>
+        </w:rPr>
+        <w:t>emote</w:t>
+      </w:r>
+      <w:proofErr w:type="gramEnd"/>
+      <w:r>
+        <w:rPr>
+          <w:rFonts w:asciiTheme="minorHAnsi" w:hAnsiTheme="minorHAnsi"/>
+          <w:sz w:val="22"/>
+          <w:szCs w:val="22"/>
+        </w:rPr>
+        <w:t xml:space="preserve"> I would have needed timer logic to clear it and would have been treating an event as if it were state, which would have been semantically wrong and added unnecessary complexity.</w:t>
+      </w:r>
+    </w:p>
+    <w:p>
+      <w:pPr>
+        <w:rPr>
+          <w:rFonts w:asciiTheme="minorHAnsi" w:hAnsiTheme="minorHAnsi"/>
+          <w:sz w:val="22"/>
+          <w:szCs w:val="22"/>
+        </w:rPr>
+      </w:pPr>
+    </w:p>
+    <w:p>
+      <w:pPr>
+        <w:rPr>
+          <w:rFonts w:asciiTheme="minorHAnsi" w:hAnsiTheme="minorHAnsi"/>
+          <w:sz w:val="22"/>
+          <w:szCs w:val="22"/>
+        </w:rPr>
+      </w:pPr>
+      <w:r>
+        <w:rPr>
+          <w:rFonts w:asciiTheme="minorHAnsi" w:hAnsiTheme="minorHAnsi"/>
+          <w:sz w:val="22"/>
+          <w:szCs w:val="22"/>
+        </w:rPr>
+        <w:t xml:space="preserve">From this I designed </w:t>
+      </w:r>
+      <w:proofErr w:type="spellStart"/>
+      <w:r>
+        <w:rPr>
+          <w:rFonts w:asciiTheme="minorHAnsi" w:hAnsiTheme="minorHAnsi"/>
+          <w:sz w:val="22"/>
+          <w:szCs w:val="22"/>
+        </w:rPr>
+        <w:t>Rpc_CastVote</w:t>
+      </w:r>
+      <w:proofErr w:type="spellEnd"/>
+      <w:r>
+        <w:rPr>
+          <w:rFonts w:asciiTheme="minorHAnsi" w:hAnsiTheme="minorHAnsi"/>
+          <w:sz w:val="22"/>
+          <w:szCs w:val="22"/>
+        </w:rPr>
+        <w:t xml:space="preserve">. It uses </w:t>
+      </w:r>
+      <w:proofErr w:type="spellStart"/>
+      <w:r>
+        <w:rPr>
+          <w:rFonts w:asciiTheme="minorHAnsi" w:hAnsiTheme="minorHAnsi"/>
+          <w:sz w:val="22"/>
+          <w:szCs w:val="22"/>
+        </w:rPr>
+        <w:t>RpcSources.All</w:t>
+      </w:r>
+      <w:proofErr w:type="spellEnd"/>
+      <w:r>
+        <w:rPr>
+          <w:rFonts w:asciiTheme="minorHAnsi" w:hAnsiTheme="minorHAnsi"/>
+          <w:sz w:val="22"/>
+          <w:szCs w:val="22"/>
+        </w:rPr>
+        <w:t xml:space="preserve">, </w:t>
+      </w:r>
+      <w:proofErr w:type="spellStart"/>
+      <w:r>
+        <w:rPr>
+          <w:rFonts w:asciiTheme="minorHAnsi" w:hAnsiTheme="minorHAnsi"/>
+          <w:sz w:val="22"/>
+          <w:szCs w:val="22"/>
+        </w:rPr>
+        <w:t>RpcTargets.StateAuthority</w:t>
+      </w:r>
+      <w:proofErr w:type="spellEnd"/>
+      <w:r>
+        <w:rPr>
+          <w:rFonts w:asciiTheme="minorHAnsi" w:hAnsiTheme="minorHAnsi"/>
+          <w:sz w:val="22"/>
+          <w:szCs w:val="22"/>
+        </w:rPr>
+        <w:t xml:space="preserve"> where any client can call it but only the </w:t>
+      </w:r>
+      <w:proofErr w:type="spellStart"/>
+      <w:r>
+        <w:rPr>
+          <w:rFonts w:asciiTheme="minorHAnsi" w:hAnsiTheme="minorHAnsi"/>
+          <w:sz w:val="22"/>
+          <w:szCs w:val="22"/>
+        </w:rPr>
+        <w:t>StateAuthority</w:t>
+      </w:r>
+      <w:proofErr w:type="spellEnd"/>
+      <w:r>
+        <w:rPr>
+          <w:rFonts w:asciiTheme="minorHAnsi" w:hAnsiTheme="minorHAnsi"/>
+          <w:sz w:val="22"/>
+          <w:szCs w:val="22"/>
+        </w:rPr>
+        <w:t xml:space="preserve"> processes it. This keeps vote counting authoritative and mirrors the Server RPC pattern from Unreal Engine, where clients send requests upward to the server for authoritative processing rather than writing state themselves.</w:t>
+      </w:r>
+    </w:p>
+    <w:p>
+      <w:pPr>
+        <w:spacing w:after="200"/>
+        <w:rPr>
+          <w:rFonts w:asciiTheme="minorHAnsi" w:hAnsiTheme="minorHAnsi"/>
+        </w:rPr>
+      </w:pPr>
+      <w:r>
+        <w:rPr>
+          <w:rFonts w:asciiTheme="minorHAnsi" w:hAnsiTheme="minorHAnsi"/>
+        </w:rPr>
+        <w:t xml:space="preserve"> </w:t>
+      </w:r>
+    </w:p>
+    <w:p>
+      <w:pPr>
+        <w:pStyle w:val="Heading4"/>
+        <w:spacing w:after="200"/>
+        <w:rPr>
+          <w:rFonts w:asciiTheme="minorHAnsi" w:hAnsiTheme="minorHAnsi"/>
+          <w:color w:val="156082" w:themeColor="accent1"/>
+        </w:rPr>
+      </w:pPr>
+      <w:r>
+        <w:rPr>
+          <w:rFonts w:asciiTheme="minorHAnsi" w:hAnsiTheme="minorHAnsi"/>
+          <w:color w:val="156082" w:themeColor="accent1"/>
+        </w:rPr>
+        <w:t>3. A Concrete Authority Model Decision</w:t>
+      </w:r>
+    </w:p>
+    <w:p>
+      <w:pPr>
+        <w:rPr>
+          <w:rFonts w:asciiTheme="minorHAnsi" w:hAnsiTheme="minorHAnsi"/>
+          <w:sz w:val="22"/>
+          <w:szCs w:val="22"/>
+        </w:rPr>
+      </w:pPr>
+      <w:r>
+        <w:rPr>
+          <w:rFonts w:asciiTheme="minorHAnsi" w:hAnsiTheme="minorHAnsi"/>
+          <w:sz w:val="22"/>
+          <w:szCs w:val="22"/>
+        </w:rPr>
+        <w:t xml:space="preserve">During the initial scene setup, an early version of the player prefab had a Camera component attached to it. When a second player joined the session, both player objects existed in each client's scene and both </w:t>
+      </w:r>
+      <w:proofErr w:type="spellStart"/>
+      <w:proofErr w:type="gramStart"/>
+      <w:r>
+        <w:rPr>
+          <w:rFonts w:asciiTheme="minorHAnsi" w:hAnsiTheme="minorHAnsi"/>
+          <w:sz w:val="22"/>
+          <w:szCs w:val="22"/>
+        </w:rPr>
+        <w:t>LateUpdate</w:t>
+      </w:r>
+      <w:proofErr w:type="spellEnd"/>
+      <w:r>
+        <w:rPr>
+          <w:rFonts w:asciiTheme="minorHAnsi" w:hAnsiTheme="minorHAnsi"/>
+          <w:sz w:val="22"/>
+          <w:szCs w:val="22"/>
+        </w:rPr>
+        <w:t>(</w:t>
+      </w:r>
+      <w:proofErr w:type="gramEnd"/>
+      <w:r>
+        <w:rPr>
+          <w:rFonts w:asciiTheme="minorHAnsi" w:hAnsiTheme="minorHAnsi"/>
+          <w:sz w:val="22"/>
+          <w:szCs w:val="22"/>
+        </w:rPr>
+        <w:t xml:space="preserve">) calls were trying to move </w:t>
+      </w:r>
+      <w:proofErr w:type="spellStart"/>
+      <w:r>
+        <w:rPr>
+          <w:rFonts w:asciiTheme="minorHAnsi" w:hAnsiTheme="minorHAnsi"/>
+          <w:sz w:val="22"/>
+          <w:szCs w:val="22"/>
+        </w:rPr>
+        <w:t>Camera.main</w:t>
+      </w:r>
+      <w:proofErr w:type="spellEnd"/>
+      <w:r>
+        <w:rPr>
+          <w:rFonts w:asciiTheme="minorHAnsi" w:hAnsiTheme="minorHAnsi"/>
+          <w:sz w:val="22"/>
+          <w:szCs w:val="22"/>
+        </w:rPr>
+        <w:t xml:space="preserve"> to their respective </w:t>
+      </w:r>
+      <w:proofErr w:type="spellStart"/>
+      <w:r>
+        <w:rPr>
+          <w:rFonts w:asciiTheme="minorHAnsi" w:hAnsiTheme="minorHAnsi"/>
+          <w:sz w:val="22"/>
+          <w:szCs w:val="22"/>
+        </w:rPr>
+        <w:t>CameraHandle</w:t>
+      </w:r>
+      <w:proofErr w:type="spellEnd"/>
+      <w:r>
+        <w:rPr>
+          <w:rFonts w:asciiTheme="minorHAnsi" w:hAnsiTheme="minorHAnsi"/>
+          <w:sz w:val="22"/>
+          <w:szCs w:val="22"/>
+        </w:rPr>
+        <w:t xml:space="preserve"> positions every frame. The result was that the camera flickered rapidly between the two positions, making the game completely unplayable for both clients.</w:t>
+      </w:r>
+    </w:p>
+    <w:p>
+      <w:pPr>
+        <w:rPr>
+          <w:rFonts w:asciiTheme="minorHAnsi" w:hAnsiTheme="minorHAnsi"/>
+          <w:sz w:val="22"/>
+          <w:szCs w:val="22"/>
+        </w:rPr>
+      </w:pPr>
+    </w:p>
+    <w:p>
+      <w:pPr>
+        <w:rPr>
+          <w:rFonts w:asciiTheme="minorHAnsi" w:hAnsiTheme="minorHAnsi"/>
+          <w:sz w:val="22"/>
+          <w:szCs w:val="22"/>
+        </w:rPr>
+      </w:pPr>
+      <w:r>
+        <w:rPr>
+          <w:rFonts w:asciiTheme="minorHAnsi" w:hAnsiTheme="minorHAnsi"/>
+          <w:sz w:val="22"/>
+          <w:szCs w:val="22"/>
+        </w:rPr>
+        <w:t xml:space="preserve">I fixed this by removing the Camera component from the player prefab entirely and keep a single Main Camera in the scene. The </w:t>
+      </w:r>
+      <w:proofErr w:type="spellStart"/>
+      <w:proofErr w:type="gramStart"/>
+      <w:r>
+        <w:rPr>
+          <w:rFonts w:asciiTheme="minorHAnsi" w:hAnsiTheme="minorHAnsi"/>
+          <w:sz w:val="22"/>
+          <w:szCs w:val="22"/>
+        </w:rPr>
+        <w:t>LateUpdate</w:t>
+      </w:r>
+      <w:proofErr w:type="spellEnd"/>
+      <w:r>
+        <w:rPr>
+          <w:rFonts w:asciiTheme="minorHAnsi" w:hAnsiTheme="minorHAnsi"/>
+          <w:sz w:val="22"/>
+          <w:szCs w:val="22"/>
+        </w:rPr>
+        <w:t>(</w:t>
+      </w:r>
+      <w:proofErr w:type="gramEnd"/>
+      <w:r>
+        <w:rPr>
+          <w:rFonts w:asciiTheme="minorHAnsi" w:hAnsiTheme="minorHAnsi"/>
+          <w:sz w:val="22"/>
+          <w:szCs w:val="22"/>
+        </w:rPr>
+        <w:t xml:space="preserve">) in </w:t>
+      </w:r>
+      <w:proofErr w:type="spellStart"/>
+      <w:r>
+        <w:rPr>
+          <w:rFonts w:asciiTheme="minorHAnsi" w:hAnsiTheme="minorHAnsi"/>
+          <w:sz w:val="22"/>
+          <w:szCs w:val="22"/>
+        </w:rPr>
+        <w:t>Player.cs</w:t>
+      </w:r>
+      <w:proofErr w:type="spellEnd"/>
+      <w:r>
+        <w:rPr>
+          <w:rFonts w:asciiTheme="minorHAnsi" w:hAnsiTheme="minorHAnsi"/>
+          <w:sz w:val="22"/>
+          <w:szCs w:val="22"/>
+        </w:rPr>
+        <w:t xml:space="preserve"> already had a </w:t>
+      </w:r>
+      <w:proofErr w:type="spellStart"/>
+      <w:r>
+        <w:rPr>
+          <w:rFonts w:asciiTheme="minorHAnsi" w:hAnsiTheme="minorHAnsi"/>
+          <w:sz w:val="22"/>
+          <w:szCs w:val="22"/>
+        </w:rPr>
+        <w:t>HasInputAuthority</w:t>
+      </w:r>
+      <w:proofErr w:type="spellEnd"/>
+      <w:r>
+        <w:rPr>
+          <w:rFonts w:asciiTheme="minorHAnsi" w:hAnsiTheme="minorHAnsi"/>
+          <w:sz w:val="22"/>
+          <w:szCs w:val="22"/>
+        </w:rPr>
+        <w:t xml:space="preserve"> guard so only the local player's object is allowed to move the camera. With the camera living in the scene rather than on the prefab, only one client ever repositions it per frame, and the remote player's object correctly skips </w:t>
+      </w:r>
+      <w:proofErr w:type="spellStart"/>
+      <w:proofErr w:type="gramStart"/>
+      <w:r>
+        <w:rPr>
+          <w:rFonts w:asciiTheme="minorHAnsi" w:hAnsiTheme="minorHAnsi"/>
+          <w:sz w:val="22"/>
+          <w:szCs w:val="22"/>
+        </w:rPr>
+        <w:t>LateUpdate</w:t>
+      </w:r>
+      <w:proofErr w:type="spellEnd"/>
+      <w:r>
+        <w:rPr>
+          <w:rFonts w:asciiTheme="minorHAnsi" w:hAnsiTheme="minorHAnsi"/>
+          <w:sz w:val="22"/>
+          <w:szCs w:val="22"/>
+        </w:rPr>
+        <w:t>(</w:t>
+      </w:r>
+      <w:proofErr w:type="gramEnd"/>
+      <w:r>
+        <w:rPr>
+          <w:rFonts w:asciiTheme="minorHAnsi" w:hAnsiTheme="minorHAnsi"/>
+          <w:sz w:val="22"/>
+          <w:szCs w:val="22"/>
+        </w:rPr>
+        <w:t xml:space="preserve">) because it does not have </w:t>
+      </w:r>
+      <w:proofErr w:type="spellStart"/>
+      <w:r>
+        <w:rPr>
+          <w:rFonts w:asciiTheme="minorHAnsi" w:hAnsiTheme="minorHAnsi"/>
+          <w:sz w:val="22"/>
+          <w:szCs w:val="22"/>
+        </w:rPr>
+        <w:t>HasInputAuthority</w:t>
+      </w:r>
+      <w:proofErr w:type="spellEnd"/>
+      <w:r>
+        <w:rPr>
+          <w:rFonts w:asciiTheme="minorHAnsi" w:hAnsiTheme="minorHAnsi"/>
+          <w:sz w:val="22"/>
+          <w:szCs w:val="22"/>
+        </w:rPr>
+        <w:t>.</w:t>
+      </w:r>
+    </w:p>
+    <w:p>
+      <w:pPr>
+        <w:spacing w:after="200"/>
+        <w:rPr>
+          <w:rFonts w:asciiTheme="minorHAnsi" w:hAnsiTheme="minorHAnsi"/>
+        </w:rPr>
+      </w:pPr>
+      <w:r>
+        <w:rPr>
+          <w:rFonts w:asciiTheme="minorHAnsi" w:hAnsiTheme="minorHAnsi"/>
+        </w:rPr>
+        <w:t xml:space="preserve"> </w:t>
+      </w:r>
+    </w:p>
+    <w:p>
+      <w:pPr>
+        <w:pStyle w:val="Heading4"/>
+        <w:spacing w:after="200"/>
         <w:rPr>
           <w:rFonts w:asciiTheme="majorHAnsi" w:hAnsiTheme="majorHAnsi"/>
           <w:color w:val="156082" w:themeColor="accent1"/>
         </w:rPr>
-        <w:t>Why I chose this feature scope</w:t>
-      </w:r>
-    </w:p>
-    <w:p>
-      <w:pPr>
-        <w:spacing w:after="200"/>
-        <w:rPr>
-          <w:rFonts w:asciiTheme="minorHAnsi" w:hAnsiTheme="minorHAnsi"/>
-          <w:sz w:val="22"/>
-          <w:szCs w:val="22"/>
-        </w:rPr>
-      </w:pPr>
-      <w:r>
-        <w:rPr>
-          <w:rFonts w:asciiTheme="minorHAnsi" w:hAnsiTheme="minorHAnsi"/>
-          <w:sz w:val="22"/>
-          <w:szCs w:val="22"/>
-        </w:rPr>
-        <w:t>The big deciding factor for the features I decided to implement for this CA was the lab work. By Week 8 the foundation already included a working Fusion Shared Mode session with KCC character movement, Unity Player Account authentication, a lobby browser, room creation and joining, player name tags, and an RPC emote system. It was only a matter of using this foundation and building up from it. This is why I decided to go for Options B and C since they both fit naturally into the Shared Mode authority model we had already been working with.</w:t>
-      </w:r>
-    </w:p>
-    <w:p>
-      <w:pPr>
-        <w:spacing w:after="200"/>
-        <w:rPr>
-          <w:rFonts w:asciiTheme="minorHAnsi" w:hAnsiTheme="minorHAnsi"/>
-          <w:sz w:val="22"/>
-          <w:szCs w:val="22"/>
-        </w:rPr>
-      </w:pPr>
-    </w:p>
-    <w:p>
-      <w:pPr>
-        <w:spacing w:after="200"/>
-        <w:rPr>
-          <w:rFonts w:asciiTheme="minorHAnsi" w:hAnsiTheme="minorHAnsi"/>
-          <w:sz w:val="22"/>
-          <w:szCs w:val="22"/>
-        </w:rPr>
-      </w:pPr>
-      <w:r>
-        <w:rPr>
-          <w:rFonts w:asciiTheme="minorHAnsi" w:hAnsiTheme="minorHAnsi"/>
-          <w:sz w:val="22"/>
-          <w:szCs w:val="22"/>
-        </w:rPr>
-        <w:t>I tackled Option C first, a networked countdown timer, since it felt like a manageable starting point that could immediately demonstrate the [Networked] property pattern across two clients. From there I added Option B, a scoring system using collectible orbs, which then enhanced Option C by giving the round a meaningful outcome, a win state based on who collected the most points.</w:t>
-      </w:r>
-    </w:p>
-    <w:p>
-      <w:pPr>
-        <w:spacing w:after="200"/>
-        <w:rPr>
-          <w:rFonts w:asciiTheme="minorHAnsi" w:hAnsiTheme="minorHAnsi"/>
-          <w:sz w:val="22"/>
-          <w:szCs w:val="22"/>
-        </w:rPr>
-      </w:pPr>
-    </w:p>
-    <w:p>
-      <w:pPr>
-        <w:spacing w:after="200"/>
-        <w:rPr>
-          <w:rFonts w:asciiTheme="minorHAnsi" w:hAnsiTheme="minorHAnsi"/>
-          <w:sz w:val="22"/>
-          <w:szCs w:val="22"/>
-        </w:rPr>
-      </w:pPr>
-      <w:r>
-        <w:rPr>
-          <w:rFonts w:asciiTheme="minorHAnsi" w:hAnsiTheme="minorHAnsi"/>
-          <w:sz w:val="22"/>
-          <w:szCs w:val="22"/>
-        </w:rPr>
-        <w:t>I deliberately left out Options A and D. Option A, server-authoritative character movement, would have required switching from Shared Mode to a server or host topology, which would have meant reimplementing the session management and authority model from scratch. Option D, networked projectiles, has similar requirements and introduces hit detection complexity that wasn't covered in the labs. Both were technically interesting but would have taken longer than the time allowed and risked producing something unstable rather than a smaller, well-tested feature.</w:t>
-      </w:r>
-    </w:p>
-    <w:p>
-      <w:pPr>
-        <w:spacing w:after="200"/>
-        <w:rPr>
-          <w:rFonts w:asciiTheme="minorHAnsi" w:hAnsiTheme="minorHAnsi"/>
-        </w:rPr>
-      </w:pPr>
-      <w:r>
-        <w:rPr>
-          <w:rFonts w:asciiTheme="minorHAnsi" w:hAnsiTheme="minorHAnsi"/>
-        </w:rPr>
-        <w:t xml:space="preserve"> </w:t>
-      </w:r>
-    </w:p>
-    <w:p>
-      <w:pPr>
-        <w:pStyle w:val="Heading4"/>
-        <w:spacing w:after="200"/>
+      </w:pPr>
+      <w:r>
         <w:rPr>
           <w:rFonts w:asciiTheme="majorHAnsi" w:hAnsiTheme="majorHAnsi"/>
           <w:color w:val="156082" w:themeColor="accent1"/>
         </w:rPr>
-      </w:pPr>
+        <w:t xml:space="preserve">4. </w:t>
+      </w:r>
       <w:r>
         <w:rPr>
           <w:rFonts w:asciiTheme="majorHAnsi" w:hAnsiTheme="majorHAnsi"/>
           <w:color w:val="156082" w:themeColor="accent1"/>
         </w:rPr>
-        <w:t>2. [Networked] Property vs RPC</w:t>
-      </w:r>
-    </w:p>
-    <w:p>
-      <w:pPr>
-        <w:rPr>
-          <w:rFonts w:asciiTheme="minorHAnsi" w:hAnsiTheme="minorHAnsi"/>
-          <w:sz w:val="22"/>
-          <w:szCs w:val="22"/>
-        </w:rPr>
-      </w:pPr>
-      <w:r>
-        <w:rPr>
-          <w:rFonts w:asciiTheme="minorHAnsi" w:hAnsiTheme="minorHAnsi"/>
-          <w:sz w:val="22"/>
-          <w:szCs w:val="22"/>
-        </w:rPr>
-        <w:t>I made use of several [Networked] properties and RPCs in this project, and the distinction between the two became clear through implementation.</w:t>
-      </w:r>
-    </w:p>
-    <w:p>
-      <w:pPr>
-        <w:rPr>
-          <w:rFonts w:asciiTheme="minorHAnsi" w:hAnsiTheme="minorHAnsi"/>
-          <w:sz w:val="22"/>
-          <w:szCs w:val="22"/>
-        </w:rPr>
-      </w:pPr>
-    </w:p>
-    <w:p>
-      <w:pPr>
-        <w:rPr>
-          <w:rFonts w:asciiTheme="minorHAnsi" w:hAnsiTheme="minorHAnsi"/>
-          <w:sz w:val="22"/>
-          <w:szCs w:val="22"/>
-        </w:rPr>
-      </w:pPr>
-      <w:r>
-        <w:rPr>
-          <w:rFonts w:asciiTheme="minorHAnsi" w:hAnsiTheme="minorHAnsi"/>
-          <w:sz w:val="22"/>
-          <w:szCs w:val="22"/>
-        </w:rPr>
-        <w:t xml:space="preserve">[Networked] properties are used for persistent state — values that any client needs to be correct at any point regardless of when they joined the session. </w:t>
+        <w:t>One thing I would do differently</w:t>
+      </w:r>
+    </w:p>
+    <w:p>
+      <w:pPr>
+        <w:rPr>
+          <w:rFonts w:asciiTheme="minorHAnsi" w:hAnsiTheme="minorHAnsi"/>
+          <w:sz w:val="22"/>
+          <w:szCs w:val="22"/>
+        </w:rPr>
+      </w:pPr>
+      <w:r>
+        <w:rPr>
+          <w:rFonts w:asciiTheme="minorHAnsi" w:hAnsiTheme="minorHAnsi"/>
+          <w:sz w:val="22"/>
+          <w:szCs w:val="22"/>
+        </w:rPr>
+        <w:t xml:space="preserve">The commit `e73acdc feat: code refactoring to follow lab examples provided` shows a significant rework that I could have avoided with better planning. When I first implemented the networking layer, I wrote a custom </w:t>
       </w:r>
       <w:proofErr w:type="spellStart"/>
       <w:r>
@@ -8844,7 +9601,7 @@
           <w:sz w:val="22"/>
           <w:szCs w:val="22"/>
         </w:rPr>
-        <w:t>TimeRemaining</w:t>
+        <w:t>NetworkManager</w:t>
       </w:r>
       <w:proofErr w:type="spellEnd"/>
       <w:r>
@@ -8853,7 +9610,16 @@
           <w:sz w:val="22"/>
           <w:szCs w:val="22"/>
         </w:rPr>
-        <w:t xml:space="preserve">, Phase, Winner, </w:t>
+        <w:t xml:space="preserve"> script based on what I understood from the </w:t>
+      </w:r>
+      <w:r>
+        <w:rPr>
+          <w:rFonts w:asciiTheme="minorHAnsi" w:hAnsiTheme="minorHAnsi"/>
+          <w:sz w:val="22"/>
+          <w:szCs w:val="22"/>
+        </w:rPr>
+        <w:lastRenderedPageBreak/>
+        <w:t xml:space="preserve">lab videos without realising that the KCC sample package already included </w:t>
       </w:r>
       <w:proofErr w:type="spellStart"/>
       <w:r>
@@ -8862,7 +9628,7 @@
           <w:sz w:val="22"/>
           <w:szCs w:val="22"/>
         </w:rPr>
-        <w:t>RematchVotes</w:t>
+        <w:t>GameplayManager</w:t>
       </w:r>
       <w:proofErr w:type="spellEnd"/>
       <w:r>
@@ -8871,33 +9637,7 @@
           <w:sz w:val="22"/>
           <w:szCs w:val="22"/>
         </w:rPr>
-        <w:t>, and Score are all persistent because a client joining mid-round must immediately see the correct timer, the correct phase, and the correct scores without any event needing to be replayed. Fusion includes these in the initial state snapshot automatically so late joiners are never out of sync.</w:t>
-      </w:r>
-    </w:p>
-    <w:p>
-      <w:pPr>
-        <w:rPr>
-          <w:rFonts w:asciiTheme="minorHAnsi" w:hAnsiTheme="minorHAnsi"/>
-          <w:sz w:val="22"/>
-          <w:szCs w:val="22"/>
-        </w:rPr>
-      </w:pPr>
-    </w:p>
-    <w:p>
-      <w:pPr>
-        <w:rPr>
-          <w:rFonts w:asciiTheme="minorHAnsi" w:hAnsiTheme="minorHAnsi"/>
-          <w:sz w:val="22"/>
-          <w:szCs w:val="22"/>
-        </w:rPr>
-      </w:pPr>
-      <w:r>
-        <w:rPr>
-          <w:rFonts w:asciiTheme="minorHAnsi" w:hAnsiTheme="minorHAnsi"/>
-          <w:sz w:val="22"/>
-          <w:szCs w:val="22"/>
-        </w:rPr>
-        <w:t xml:space="preserve">RPCs are the right tool for one-shot events that do not need to be preserved. </w:t>
+        <w:t xml:space="preserve"> for player spawning and that </w:t>
       </w:r>
       <w:proofErr w:type="spellStart"/>
       <w:r>
@@ -8906,7 +9646,7 @@
           <w:sz w:val="22"/>
           <w:szCs w:val="22"/>
         </w:rPr>
-        <w:t>Rpc_GameOver</w:t>
+        <w:t>FusionBootstrap</w:t>
       </w:r>
       <w:proofErr w:type="spellEnd"/>
       <w:r>
@@ -8915,7 +9655,15 @@
           <w:sz w:val="22"/>
           <w:szCs w:val="22"/>
         </w:rPr>
-        <w:t xml:space="preserve"> starts once when the timer hits zero — a late-joining client does not need to receive it because Phase == </w:t>
+        <w:t xml:space="preserve"> </w:t>
+      </w:r>
+      <w:r>
+        <w:rPr>
+          <w:rFonts w:asciiTheme="minorHAnsi" w:hAnsiTheme="minorHAnsi"/>
+          <w:sz w:val="22"/>
+          <w:szCs w:val="22"/>
+        </w:rPr>
+        <w:t xml:space="preserve">could be modified directly to handle authentication. Both my </w:t>
       </w:r>
       <w:proofErr w:type="spellStart"/>
       <w:r>
@@ -8924,7 +9672,7 @@
           <w:sz w:val="22"/>
           <w:szCs w:val="22"/>
         </w:rPr>
-        <w:t>GameOver</w:t>
+        <w:t>NetworkManager</w:t>
       </w:r>
       <w:proofErr w:type="spellEnd"/>
       <w:r>
@@ -8933,7 +9681,7 @@
           <w:sz w:val="22"/>
           <w:szCs w:val="22"/>
         </w:rPr>
-        <w:t xml:space="preserve"> in the state snapshot already communicates that the round has ended. </w:t>
+        <w:t xml:space="preserve"> and my </w:t>
       </w:r>
       <w:proofErr w:type="spellStart"/>
       <w:r>
@@ -8942,7 +9690,7 @@
           <w:sz w:val="22"/>
           <w:szCs w:val="22"/>
         </w:rPr>
-        <w:t>Rpc_PlayEmote</w:t>
+        <w:t>PlayerSpawner</w:t>
       </w:r>
       <w:proofErr w:type="spellEnd"/>
       <w:r>
@@ -8951,517 +9699,7 @@
           <w:sz w:val="22"/>
           <w:szCs w:val="22"/>
         </w:rPr>
-        <w:t xml:space="preserve"> starts once per keypress — there is no meaningful "current emote" state to store. If I had used a [Networked] string for the emote I would have needed timer logic to clear it and would have been treating an event as if it were state, which would have been semantically wrong and added unnecessary complexity.</w:t>
-      </w:r>
-    </w:p>
-    <w:p>
-      <w:pPr>
-        <w:rPr>
-          <w:rFonts w:asciiTheme="minorHAnsi" w:hAnsiTheme="minorHAnsi"/>
-          <w:sz w:val="22"/>
-          <w:szCs w:val="22"/>
-        </w:rPr>
-      </w:pPr>
-    </w:p>
-    <w:p>
-      <w:pPr>
-        <w:rPr>
-          <w:rFonts w:asciiTheme="minorHAnsi" w:hAnsiTheme="minorHAnsi"/>
-          <w:sz w:val="22"/>
-          <w:szCs w:val="22"/>
-        </w:rPr>
-      </w:pPr>
-      <w:r>
-        <w:rPr>
-          <w:rFonts w:asciiTheme="minorHAnsi" w:hAnsiTheme="minorHAnsi"/>
-          <w:sz w:val="22"/>
-          <w:szCs w:val="22"/>
-        </w:rPr>
-        <w:t xml:space="preserve">From this I designed </w:t>
-      </w:r>
-      <w:proofErr w:type="spellStart"/>
-      <w:r>
-        <w:rPr>
-          <w:rFonts w:asciiTheme="minorHAnsi" w:hAnsiTheme="minorHAnsi"/>
-          <w:sz w:val="22"/>
-          <w:szCs w:val="22"/>
-        </w:rPr>
-        <w:t>Rpc_CastVote</w:t>
-      </w:r>
-      <w:proofErr w:type="spellEnd"/>
-      <w:r>
-        <w:rPr>
-          <w:rFonts w:asciiTheme="minorHAnsi" w:hAnsiTheme="minorHAnsi"/>
-          <w:sz w:val="22"/>
-          <w:szCs w:val="22"/>
-        </w:rPr>
-        <w:t xml:space="preserve">. It uses </w:t>
-      </w:r>
-      <w:proofErr w:type="spellStart"/>
-      <w:r>
-        <w:rPr>
-          <w:rFonts w:asciiTheme="minorHAnsi" w:hAnsiTheme="minorHAnsi"/>
-          <w:sz w:val="22"/>
-          <w:szCs w:val="22"/>
-        </w:rPr>
-        <w:t>RpcSources.All</w:t>
-      </w:r>
-      <w:proofErr w:type="spellEnd"/>
-      <w:r>
-        <w:rPr>
-          <w:rFonts w:asciiTheme="minorHAnsi" w:hAnsiTheme="minorHAnsi"/>
-          <w:sz w:val="22"/>
-          <w:szCs w:val="22"/>
-        </w:rPr>
-        <w:t xml:space="preserve">, </w:t>
-      </w:r>
-      <w:proofErr w:type="spellStart"/>
-      <w:r>
-        <w:rPr>
-          <w:rFonts w:asciiTheme="minorHAnsi" w:hAnsiTheme="minorHAnsi"/>
-          <w:sz w:val="22"/>
-          <w:szCs w:val="22"/>
-        </w:rPr>
-        <w:t>RpcTargets.StateAuthority</w:t>
-      </w:r>
-      <w:proofErr w:type="spellEnd"/>
-      <w:r>
-        <w:rPr>
-          <w:rFonts w:asciiTheme="minorHAnsi" w:hAnsiTheme="minorHAnsi"/>
-          <w:sz w:val="22"/>
-          <w:szCs w:val="22"/>
-        </w:rPr>
-        <w:t xml:space="preserve"> where any client can call it but only the </w:t>
-      </w:r>
-      <w:proofErr w:type="spellStart"/>
-      <w:r>
-        <w:rPr>
-          <w:rFonts w:asciiTheme="minorHAnsi" w:hAnsiTheme="minorHAnsi"/>
-          <w:sz w:val="22"/>
-          <w:szCs w:val="22"/>
-        </w:rPr>
-        <w:t>StateAuthority</w:t>
-      </w:r>
-      <w:proofErr w:type="spellEnd"/>
-      <w:r>
-        <w:rPr>
-          <w:rFonts w:asciiTheme="minorHAnsi" w:hAnsiTheme="minorHAnsi"/>
-          <w:sz w:val="22"/>
-          <w:szCs w:val="22"/>
-        </w:rPr>
-        <w:t xml:space="preserve"> processes it. This keeps vote counting </w:t>
-      </w:r>
-      <w:r>
-        <w:rPr>
-          <w:rFonts w:asciiTheme="minorHAnsi" w:hAnsiTheme="minorHAnsi"/>
-          <w:sz w:val="22"/>
-          <w:szCs w:val="22"/>
-        </w:rPr>
-        <w:lastRenderedPageBreak/>
-        <w:t>authoritative and mirrors the Server RPC pattern from Unreal Engine, where clients send requests upward to the server for authoritative processing rather than writing state themselves.</w:t>
-      </w:r>
-    </w:p>
-    <w:p>
-      <w:pPr>
-        <w:spacing w:after="200"/>
-        <w:rPr>
-          <w:rFonts w:asciiTheme="minorHAnsi" w:hAnsiTheme="minorHAnsi"/>
-        </w:rPr>
-      </w:pPr>
-      <w:r>
-        <w:rPr>
-          <w:rFonts w:asciiTheme="minorHAnsi" w:hAnsiTheme="minorHAnsi"/>
-        </w:rPr>
-        <w:t xml:space="preserve"> </w:t>
-      </w:r>
-    </w:p>
-    <w:p>
-      <w:pPr>
-        <w:pStyle w:val="Heading4"/>
-        <w:spacing w:after="200"/>
-        <w:rPr>
-          <w:rFonts w:asciiTheme="minorHAnsi" w:hAnsiTheme="minorHAnsi"/>
-          <w:color w:val="156082" w:themeColor="accent1"/>
-        </w:rPr>
-      </w:pPr>
-      <w:r>
-        <w:rPr>
-          <w:rFonts w:asciiTheme="minorHAnsi" w:hAnsiTheme="minorHAnsi"/>
-          <w:color w:val="156082" w:themeColor="accent1"/>
-        </w:rPr>
-        <w:t>3. A Concrete Authority Model Decision</w:t>
-      </w:r>
-    </w:p>
-    <w:p>
-      <w:pPr>
-        <w:rPr>
-          <w:rFonts w:asciiTheme="minorHAnsi" w:hAnsiTheme="minorHAnsi"/>
-          <w:sz w:val="22"/>
-          <w:szCs w:val="22"/>
-        </w:rPr>
-      </w:pPr>
-      <w:r>
-        <w:rPr>
-          <w:rFonts w:asciiTheme="minorHAnsi" w:hAnsiTheme="minorHAnsi"/>
-          <w:sz w:val="22"/>
-          <w:szCs w:val="22"/>
-        </w:rPr>
-        <w:t xml:space="preserve">During the initial scene setup, an early version of the player prefab had a Camera component attached to it. When a second player joined the session, both player objects existed in each client's scene and both </w:t>
-      </w:r>
-      <w:proofErr w:type="spellStart"/>
-      <w:r>
-        <w:rPr>
-          <w:rFonts w:asciiTheme="minorHAnsi" w:hAnsiTheme="minorHAnsi"/>
-          <w:sz w:val="22"/>
-          <w:szCs w:val="22"/>
-        </w:rPr>
-        <w:t>LateUpdate</w:t>
-      </w:r>
-      <w:proofErr w:type="spellEnd"/>
-      <w:r>
-        <w:rPr>
-          <w:rFonts w:asciiTheme="minorHAnsi" w:hAnsiTheme="minorHAnsi"/>
-          <w:sz w:val="22"/>
-          <w:szCs w:val="22"/>
-        </w:rPr>
-        <w:t xml:space="preserve">() calls were trying to move </w:t>
-      </w:r>
-      <w:proofErr w:type="spellStart"/>
-      <w:r>
-        <w:rPr>
-          <w:rFonts w:asciiTheme="minorHAnsi" w:hAnsiTheme="minorHAnsi"/>
-          <w:sz w:val="22"/>
-          <w:szCs w:val="22"/>
-        </w:rPr>
-        <w:t>Camera.main</w:t>
-      </w:r>
-      <w:proofErr w:type="spellEnd"/>
-      <w:r>
-        <w:rPr>
-          <w:rFonts w:asciiTheme="minorHAnsi" w:hAnsiTheme="minorHAnsi"/>
-          <w:sz w:val="22"/>
-          <w:szCs w:val="22"/>
-        </w:rPr>
-        <w:t xml:space="preserve"> to their respective </w:t>
-      </w:r>
-      <w:proofErr w:type="spellStart"/>
-      <w:r>
-        <w:rPr>
-          <w:rFonts w:asciiTheme="minorHAnsi" w:hAnsiTheme="minorHAnsi"/>
-          <w:sz w:val="22"/>
-          <w:szCs w:val="22"/>
-        </w:rPr>
-        <w:t>CameraHandle</w:t>
-      </w:r>
-      <w:proofErr w:type="spellEnd"/>
-      <w:r>
-        <w:rPr>
-          <w:rFonts w:asciiTheme="minorHAnsi" w:hAnsiTheme="minorHAnsi"/>
-          <w:sz w:val="22"/>
-          <w:szCs w:val="22"/>
-        </w:rPr>
-        <w:t xml:space="preserve"> positions every frame. The result was that the camera flickered rapidly between the two positions, making the game completely unplayable for both clients.</w:t>
-      </w:r>
-    </w:p>
-    <w:p>
-      <w:pPr>
-        <w:rPr>
-          <w:rFonts w:asciiTheme="minorHAnsi" w:hAnsiTheme="minorHAnsi"/>
-          <w:sz w:val="22"/>
-          <w:szCs w:val="22"/>
-        </w:rPr>
-      </w:pPr>
-    </w:p>
-    <w:p>
-      <w:pPr>
-        <w:rPr>
-          <w:rFonts w:asciiTheme="minorHAnsi" w:hAnsiTheme="minorHAnsi"/>
-          <w:sz w:val="22"/>
-          <w:szCs w:val="22"/>
-        </w:rPr>
-      </w:pPr>
-      <w:r>
-        <w:rPr>
-          <w:rFonts w:asciiTheme="minorHAnsi" w:hAnsiTheme="minorHAnsi"/>
-          <w:sz w:val="22"/>
-          <w:szCs w:val="22"/>
-        </w:rPr>
-        <w:t xml:space="preserve">I fixed this by removing the Camera component from the player prefab entirely and keep a single Main Camera in the scene. The </w:t>
-      </w:r>
-      <w:proofErr w:type="spellStart"/>
-      <w:r>
-        <w:rPr>
-          <w:rFonts w:asciiTheme="minorHAnsi" w:hAnsiTheme="minorHAnsi"/>
-          <w:sz w:val="22"/>
-          <w:szCs w:val="22"/>
-        </w:rPr>
-        <w:t>LateUpdate</w:t>
-      </w:r>
-      <w:proofErr w:type="spellEnd"/>
-      <w:r>
-        <w:rPr>
-          <w:rFonts w:asciiTheme="minorHAnsi" w:hAnsiTheme="minorHAnsi"/>
-          <w:sz w:val="22"/>
-          <w:szCs w:val="22"/>
-        </w:rPr>
-        <w:t xml:space="preserve">() in </w:t>
-      </w:r>
-      <w:proofErr w:type="spellStart"/>
-      <w:r>
-        <w:rPr>
-          <w:rFonts w:asciiTheme="minorHAnsi" w:hAnsiTheme="minorHAnsi"/>
-          <w:sz w:val="22"/>
-          <w:szCs w:val="22"/>
-        </w:rPr>
-        <w:t>Player.cs</w:t>
-      </w:r>
-      <w:proofErr w:type="spellEnd"/>
-      <w:r>
-        <w:rPr>
-          <w:rFonts w:asciiTheme="minorHAnsi" w:hAnsiTheme="minorHAnsi"/>
-          <w:sz w:val="22"/>
-          <w:szCs w:val="22"/>
-        </w:rPr>
-        <w:t xml:space="preserve"> already had a </w:t>
-      </w:r>
-      <w:proofErr w:type="spellStart"/>
-      <w:r>
-        <w:rPr>
-          <w:rFonts w:asciiTheme="minorHAnsi" w:hAnsiTheme="minorHAnsi"/>
-          <w:sz w:val="22"/>
-          <w:szCs w:val="22"/>
-        </w:rPr>
-        <w:t>HasInputAuthority</w:t>
-      </w:r>
-      <w:proofErr w:type="spellEnd"/>
-      <w:r>
-        <w:rPr>
-          <w:rFonts w:asciiTheme="minorHAnsi" w:hAnsiTheme="minorHAnsi"/>
-          <w:sz w:val="22"/>
-          <w:szCs w:val="22"/>
-        </w:rPr>
-        <w:t xml:space="preserve"> guard so only the local player's object is allowed to move the camera. With the camera living in the scene rather than on the prefab, only one client ever repositions it per frame, and the remote player's object correctly skips </w:t>
-      </w:r>
-      <w:proofErr w:type="spellStart"/>
-      <w:r>
-        <w:rPr>
-          <w:rFonts w:asciiTheme="minorHAnsi" w:hAnsiTheme="minorHAnsi"/>
-          <w:sz w:val="22"/>
-          <w:szCs w:val="22"/>
-        </w:rPr>
-        <w:t>LateUpdate</w:t>
-      </w:r>
-      <w:proofErr w:type="spellEnd"/>
-      <w:r>
-        <w:rPr>
-          <w:rFonts w:asciiTheme="minorHAnsi" w:hAnsiTheme="minorHAnsi"/>
-          <w:sz w:val="22"/>
-          <w:szCs w:val="22"/>
-        </w:rPr>
-        <w:t xml:space="preserve">() because it does not have </w:t>
-      </w:r>
-      <w:proofErr w:type="spellStart"/>
-      <w:r>
-        <w:rPr>
-          <w:rFonts w:asciiTheme="minorHAnsi" w:hAnsiTheme="minorHAnsi"/>
-          <w:sz w:val="22"/>
-          <w:szCs w:val="22"/>
-        </w:rPr>
-        <w:t>HasInputAuthority</w:t>
-      </w:r>
-      <w:proofErr w:type="spellEnd"/>
-      <w:r>
-        <w:rPr>
-          <w:rFonts w:asciiTheme="minorHAnsi" w:hAnsiTheme="minorHAnsi"/>
-          <w:sz w:val="22"/>
-          <w:szCs w:val="22"/>
-        </w:rPr>
-        <w:t>.</w:t>
-      </w:r>
-    </w:p>
-    <w:p>
-      <w:pPr>
-        <w:spacing w:after="200"/>
-        <w:rPr>
-          <w:rFonts w:asciiTheme="minorHAnsi" w:hAnsiTheme="minorHAnsi"/>
-        </w:rPr>
-      </w:pPr>
-      <w:r>
-        <w:rPr>
-          <w:rFonts w:asciiTheme="minorHAnsi" w:hAnsiTheme="minorHAnsi"/>
-        </w:rPr>
-        <w:t xml:space="preserve"> </w:t>
-      </w:r>
-    </w:p>
-    <w:p>
-      <w:pPr>
-        <w:pStyle w:val="Heading4"/>
-        <w:spacing w:after="200"/>
-        <w:rPr>
-          <w:rFonts w:asciiTheme="majorHAnsi" w:hAnsiTheme="majorHAnsi"/>
-          <w:color w:val="156082" w:themeColor="accent1"/>
-        </w:rPr>
-      </w:pPr>
-      <w:r>
-        <w:rPr>
-          <w:rFonts w:asciiTheme="majorHAnsi" w:hAnsiTheme="majorHAnsi"/>
-          <w:color w:val="156082" w:themeColor="accent1"/>
-        </w:rPr>
-        <w:t xml:space="preserve">4. </w:t>
-      </w:r>
-      <w:r>
-        <w:rPr>
-          <w:rFonts w:asciiTheme="majorHAnsi" w:hAnsiTheme="majorHAnsi"/>
-          <w:color w:val="156082" w:themeColor="accent1"/>
-        </w:rPr>
-        <w:t>One thing I would do differently</w:t>
-      </w:r>
-    </w:p>
-    <w:p>
-      <w:pPr>
-        <w:rPr>
-          <w:rFonts w:asciiTheme="minorHAnsi" w:hAnsiTheme="minorHAnsi"/>
-          <w:sz w:val="22"/>
-          <w:szCs w:val="22"/>
-        </w:rPr>
-      </w:pPr>
-      <w:r>
-        <w:rPr>
-          <w:rFonts w:asciiTheme="minorHAnsi" w:hAnsiTheme="minorHAnsi"/>
-          <w:sz w:val="22"/>
-          <w:szCs w:val="22"/>
-        </w:rPr>
-        <w:t xml:space="preserve">The commit `e73acdc feat: code refactoring to follow lab examples provided` shows a significant rework that I could have avoided with better planning. When I first implemented the networking </w:t>
-      </w:r>
-      <w:r>
-        <w:rPr>
-          <w:rFonts w:asciiTheme="minorHAnsi" w:hAnsiTheme="minorHAnsi"/>
-          <w:sz w:val="22"/>
-          <w:szCs w:val="22"/>
-        </w:rPr>
-        <w:t>layer,</w:t>
-      </w:r>
-      <w:r>
-        <w:rPr>
-          <w:rFonts w:asciiTheme="minorHAnsi" w:hAnsiTheme="minorHAnsi"/>
-          <w:sz w:val="22"/>
-          <w:szCs w:val="22"/>
-        </w:rPr>
-        <w:t xml:space="preserve"> I wrote a custom </w:t>
-      </w:r>
-      <w:proofErr w:type="spellStart"/>
-      <w:r>
-        <w:rPr>
-          <w:rFonts w:asciiTheme="minorHAnsi" w:hAnsiTheme="minorHAnsi"/>
-          <w:sz w:val="22"/>
-          <w:szCs w:val="22"/>
-        </w:rPr>
-        <w:t>NetworkManager</w:t>
-      </w:r>
-      <w:proofErr w:type="spellEnd"/>
-      <w:r>
-        <w:rPr>
-          <w:rFonts w:asciiTheme="minorHAnsi" w:hAnsiTheme="minorHAnsi"/>
-          <w:sz w:val="22"/>
-          <w:szCs w:val="22"/>
-        </w:rPr>
-        <w:t xml:space="preserve"> script based on what I understood from the lab videos without realising that the KCC sample package already included </w:t>
-      </w:r>
-      <w:proofErr w:type="spellStart"/>
-      <w:r>
-        <w:rPr>
-          <w:rFonts w:asciiTheme="minorHAnsi" w:hAnsiTheme="minorHAnsi"/>
-          <w:sz w:val="22"/>
-          <w:szCs w:val="22"/>
-        </w:rPr>
-        <w:t>GameplayManager</w:t>
-      </w:r>
-      <w:proofErr w:type="spellEnd"/>
-      <w:r>
-        <w:rPr>
-          <w:rFonts w:asciiTheme="minorHAnsi" w:hAnsiTheme="minorHAnsi"/>
-          <w:sz w:val="22"/>
-          <w:szCs w:val="22"/>
-        </w:rPr>
-        <w:t xml:space="preserve"> for player spawning and that </w:t>
-      </w:r>
-      <w:proofErr w:type="spellStart"/>
-      <w:r>
-        <w:rPr>
-          <w:rFonts w:asciiTheme="minorHAnsi" w:hAnsiTheme="minorHAnsi"/>
-          <w:sz w:val="22"/>
-          <w:szCs w:val="22"/>
-        </w:rPr>
-        <w:t>FusionBootstrap</w:t>
-      </w:r>
-      <w:proofErr w:type="spellEnd"/>
-      <w:r>
-        <w:rPr>
-          <w:rFonts w:asciiTheme="minorHAnsi" w:hAnsiTheme="minorHAnsi"/>
-          <w:sz w:val="22"/>
-          <w:szCs w:val="22"/>
-        </w:rPr>
-        <w:t xml:space="preserve"> </w:t>
-      </w:r>
-      <w:r>
-        <w:rPr>
-          <w:rFonts w:asciiTheme="minorHAnsi" w:hAnsiTheme="minorHAnsi"/>
-          <w:sz w:val="22"/>
-          <w:szCs w:val="22"/>
-        </w:rPr>
-        <w:t xml:space="preserve">could be modified directly to handle authentication. Both my </w:t>
-      </w:r>
-      <w:proofErr w:type="spellStart"/>
-      <w:r>
-        <w:rPr>
-          <w:rFonts w:asciiTheme="minorHAnsi" w:hAnsiTheme="minorHAnsi"/>
-          <w:sz w:val="22"/>
-          <w:szCs w:val="22"/>
-        </w:rPr>
-        <w:t>NetworkManager</w:t>
-      </w:r>
-      <w:proofErr w:type="spellEnd"/>
-      <w:r>
-        <w:rPr>
-          <w:rFonts w:asciiTheme="minorHAnsi" w:hAnsiTheme="minorHAnsi"/>
-          <w:sz w:val="22"/>
-          <w:szCs w:val="22"/>
-        </w:rPr>
-        <w:t xml:space="preserve"> and my </w:t>
-      </w:r>
-      <w:proofErr w:type="spellStart"/>
-      <w:r>
-        <w:rPr>
-          <w:rFonts w:asciiTheme="minorHAnsi" w:hAnsiTheme="minorHAnsi"/>
-          <w:sz w:val="22"/>
-          <w:szCs w:val="22"/>
-        </w:rPr>
-        <w:t>PlayerSpawner</w:t>
-      </w:r>
-      <w:proofErr w:type="spellEnd"/>
-      <w:r>
-        <w:rPr>
-          <w:rFonts w:asciiTheme="minorHAnsi" w:hAnsiTheme="minorHAnsi"/>
-          <w:sz w:val="22"/>
-          <w:szCs w:val="22"/>
-        </w:rPr>
-        <w:t xml:space="preserve"> were essentially duplicates of scripts that already existed. Replacing them was a bit time consuming so I wish I had used the provided content </w:t>
-      </w:r>
-      <w:r>
-        <w:rPr>
-          <w:rFonts w:asciiTheme="minorHAnsi" w:hAnsiTheme="minorHAnsi"/>
-          <w:sz w:val="22"/>
-          <w:szCs w:val="22"/>
-        </w:rPr>
-        <w:t>from the get-go</w:t>
-      </w:r>
-      <w:r>
-        <w:rPr>
-          <w:rFonts w:asciiTheme="minorHAnsi" w:hAnsiTheme="minorHAnsi"/>
-          <w:sz w:val="22"/>
-          <w:szCs w:val="22"/>
-        </w:rPr>
-        <w:t>.</w:t>
+        <w:t xml:space="preserve"> were essentially duplicates of scripts that already existed. Replacing them was a bit time consuming so I wish I had used the provided content from the get-go.</w:t>
       </w:r>
     </w:p>
     <w:p>
@@ -9528,39 +9766,7 @@
           <w:sz w:val="22"/>
           <w:szCs w:val="22"/>
         </w:rPr>
-        <w:t xml:space="preserve">I would say one of my biggest regrets would be not starting the CA sooner. I am </w:t>
-      </w:r>
-      <w:r>
-        <w:rPr>
-          <w:rFonts w:asciiTheme="minorHAnsi" w:hAnsiTheme="minorHAnsi"/>
-          <w:sz w:val="22"/>
-          <w:szCs w:val="22"/>
-        </w:rPr>
-        <w:t>happy</w:t>
-      </w:r>
-      <w:r>
-        <w:rPr>
-          <w:rFonts w:asciiTheme="minorHAnsi" w:hAnsiTheme="minorHAnsi"/>
-          <w:sz w:val="22"/>
-          <w:szCs w:val="22"/>
-        </w:rPr>
-        <w:t xml:space="preserve"> with the work I managed to produce for this </w:t>
-      </w:r>
-      <w:r>
-        <w:rPr>
-          <w:rFonts w:asciiTheme="minorHAnsi" w:hAnsiTheme="minorHAnsi"/>
-          <w:sz w:val="22"/>
-          <w:szCs w:val="22"/>
-        </w:rPr>
-        <w:t>CA,</w:t>
-      </w:r>
-      <w:r>
-        <w:rPr>
-          <w:rFonts w:asciiTheme="minorHAnsi" w:hAnsiTheme="minorHAnsi"/>
-          <w:sz w:val="22"/>
-          <w:szCs w:val="22"/>
-        </w:rPr>
-        <w:t xml:space="preserve"> but it would've been better to not have to give myself extra pressure of leaving things late especially since I should've been </w:t>
+        <w:t xml:space="preserve">I would say one of my biggest regrets would be not starting the CA sooner. I am happy with the work I managed to produce for this CA, but it would've been better to not have to give myself extra pressure of leaving things late especially since I should've been </w:t>
       </w:r>
       <w:proofErr w:type="spellStart"/>
       <w:r>
@@ -9578,23 +9784,25 @@
           <w:sz w:val="22"/>
           <w:szCs w:val="22"/>
         </w:rPr>
-        <w:t xml:space="preserve"> regularly each week. However, I did complete the lab work before starting the CA and I did find it </w:t>
-      </w:r>
-      <w:r>
-        <w:rPr>
-          <w:rFonts w:asciiTheme="minorHAnsi" w:hAnsiTheme="minorHAnsi"/>
-          <w:sz w:val="22"/>
-          <w:szCs w:val="22"/>
-        </w:rPr>
-        <w:t>helpful</w:t>
-      </w:r>
-      <w:r>
-        <w:rPr>
-          <w:rFonts w:asciiTheme="minorHAnsi" w:hAnsiTheme="minorHAnsi"/>
-          <w:sz w:val="22"/>
-          <w:szCs w:val="22"/>
-        </w:rPr>
-        <w:t xml:space="preserve"> since it gave me a nice baseline to work with and actually made the CA a lot easier in the process. I hope to keep up with the lab content going into CA3.</w:t>
+        <w:t xml:space="preserve"> regularly each week. However, I did complete the lab work before starting the CA and I did find it helpful since it gave me a nice baseline to work with and </w:t>
+      </w:r>
+      <w:proofErr w:type="gramStart"/>
+      <w:r>
+        <w:rPr>
+          <w:rFonts w:asciiTheme="minorHAnsi" w:hAnsiTheme="minorHAnsi"/>
+          <w:sz w:val="22"/>
+          <w:szCs w:val="22"/>
+        </w:rPr>
+        <w:t>actually made</w:t>
+      </w:r>
+      <w:proofErr w:type="gramEnd"/>
+      <w:r>
+        <w:rPr>
+          <w:rFonts w:asciiTheme="minorHAnsi" w:hAnsiTheme="minorHAnsi"/>
+          <w:sz w:val="22"/>
+          <w:szCs w:val="22"/>
+        </w:rPr>
+        <w:t xml:space="preserve"> the CA a lot easier in the process. I hope to keep up with the lab content going into CA3.</w:t>
       </w:r>
     </w:p>
     <w:p>
@@ -9764,16 +9972,7 @@
           <w:sz w:val="22"/>
           <w:szCs w:val="22"/>
         </w:rPr>
-        <w:t xml:space="preserve"> using my custom auth URL on the Photon dashboard. The Photon dashboard custom auth URL must include `?code=KEY` appended directly to the URL. This cost a full session to diagnose. My Azure Function </w:t>
-      </w:r>
-      <w:r>
-        <w:rPr>
-          <w:rFonts w:asciiTheme="minorHAnsi" w:hAnsiTheme="minorHAnsi"/>
-          <w:sz w:val="22"/>
-          <w:szCs w:val="22"/>
-        </w:rPr>
-        <w:lastRenderedPageBreak/>
-        <w:t>Monitor showing zero invocations was a big sign that it must not have been invoked at all, if the function is never called, the problem is in the URL configuration, not the function code itself.</w:t>
+        <w:t xml:space="preserve"> using my custom auth URL on the Photon dashboard. The Photon dashboard custom auth URL must include `?code=KEY` appended directly to the URL. This cost a full session to diagnose. My Azure Function Monitor showing zero invocations was a big sign that it must not have been invoked at all, if the function is never called, the problem is in the URL configuration, not the function code itself.</w:t>
       </w:r>
     </w:p>
     <w:p>
@@ -10054,6 +10253,7 @@
           <w:sz w:val="22"/>
           <w:szCs w:val="22"/>
         </w:rPr>
+        <w:lastRenderedPageBreak/>
         <w:t xml:space="preserve">See: </w:t>
       </w:r>
       <w:r>
@@ -12508,6 +12708,7 @@
   <w:style w:type="character" w:default="1" w:styleId="DefaultParagraphFont">
     <w:name w:val="Default Paragraph Font"/>
     <w:uiPriority w:val="1"/>
+    <w:semiHidden/>
     <w:unhideWhenUsed/>
   </w:style>
   <w:style w:type="table" w:default="1" w:styleId="TableNormal">

</xml_diff>